<commit_message>
finished exercise 9 logic
</commit_message>
<xml_diff>
--- a/Fall-2025/logic-for-cs/exercise-set-9.docx
+++ b/Fall-2025/logic-for-cs/exercise-set-9.docx
@@ -17,10 +17,7 @@
         <w:t>1</w:t>
       </w:r>
       <w:r>
-        <w:t>1/</w:t>
-      </w:r>
-      <w:r>
-        <w:t>14</w:t>
+        <w:t>1/14</w:t>
       </w:r>
       <w:r>
         <w:t>/25</w:t>
@@ -58,19 +55,77 @@
           <w:b/>
           <w:bCs/>
         </w:rPr>
-        <w:t>Exercise 5</w:t>
-      </w:r>
+        <w:t>Exercise 57</w:t>
+      </w:r>
+    </w:p>
+    <w:p>
+      <w:r>
+        <w:t>(</w:t>
+      </w:r>
+      <w:r>
+        <w:rPr>
+          <w:rFonts w:ascii="Cambria Math" w:hAnsi="Cambria Math" w:cs="Cambria Math"/>
+        </w:rPr>
+        <w:t>∀</w:t>
+      </w:r>
+      <w:r>
+        <w:t xml:space="preserve">x(Q(x, </w:t>
+      </w:r>
+      <w:r>
+        <w:t>a</w:t>
+      </w:r>
+      <w:r>
+        <w:t xml:space="preserve">, </w:t>
+      </w:r>
+      <w:r>
+        <w:t>x</w:t>
+      </w:r>
+      <w:r>
+        <w:t xml:space="preserve">)) </w:t>
+      </w:r>
+      <w:r>
+        <w:rPr>
+          <w:rFonts w:ascii="Cambria Math" w:hAnsi="Cambria Math" w:cs="Cambria Math"/>
+        </w:rPr>
+        <w:t>∧</w:t>
+      </w:r>
+      <w:r>
+        <w:t xml:space="preserve"> </w:t>
+      </w:r>
+      <w:r>
+        <w:rPr>
+          <w:rFonts w:ascii="Cambria Math" w:hAnsi="Cambria Math" w:cs="Cambria Math"/>
+        </w:rPr>
+        <w:t>∀</w:t>
+      </w:r>
+      <w:r>
+        <w:t>x(P (</w:t>
+      </w:r>
+      <w:r>
+        <w:t>a</w:t>
+      </w:r>
+      <w:r>
+        <w:t xml:space="preserve">, </w:t>
+      </w:r>
+      <w:r>
+        <w:t>a</w:t>
+      </w:r>
+      <w:r>
+        <w:t>)))</w:t>
+      </w:r>
+    </w:p>
+    <w:p>
       <w:r>
         <w:rPr>
           <w:b/>
           <w:bCs/>
         </w:rPr>
-        <w:t>7</w:t>
-      </w:r>
-    </w:p>
-    <w:p>
-      <w:r>
-        <w:t>(</w:t>
+        <w:t>Exercise 58</w:t>
+      </w:r>
+    </w:p>
+    <w:p>
+      <w:r>
+        <w:t xml:space="preserve">Because of how substitution works, for </w:t>
       </w:r>
       <w:r>
         <w:rPr>
@@ -79,25 +134,46 @@
         <w:t>∀</w:t>
       </w:r>
       <w:r>
-        <w:t xml:space="preserve">x(Q(x, </w:t>
-      </w:r>
-      <w:r>
-        <w:t>a</w:t>
-      </w:r>
-      <w:r>
-        <w:t xml:space="preserve">, </w:t>
-      </w:r>
-      <w:r>
-        <w:t>x</w:t>
-      </w:r>
-      <w:r>
-        <w:t xml:space="preserve">)) </w:t>
-      </w:r>
-      <w:r>
-        <w:rPr>
-          <w:rFonts w:ascii="Cambria Math" w:hAnsi="Cambria Math" w:cs="Cambria Math"/>
-        </w:rPr>
-        <w:t>∧</w:t>
+        <w:t>yF[x/y</w:t>
+      </w:r>
+      <w:r>
+        <w:t xml:space="preserve">], any occurrence of x in F will be replaced by y. For example, if F is P(x, z), then </w:t>
+      </w:r>
+      <w:r>
+        <w:rPr>
+          <w:rFonts w:ascii="Cambria Math" w:hAnsi="Cambria Math" w:cs="Cambria Math"/>
+        </w:rPr>
+        <w:t>∀</w:t>
+      </w:r>
+      <w:r>
+        <w:t>yF[x/y</w:t>
+      </w:r>
+      <w:r>
+        <w:t xml:space="preserve">] becomes </w:t>
+      </w:r>
+      <w:r>
+        <w:rPr>
+          <w:rFonts w:ascii="Cambria Math" w:hAnsi="Cambria Math" w:cs="Cambria Math"/>
+        </w:rPr>
+        <w:t>∀</w:t>
+      </w:r>
+      <w:r>
+        <w:t>y</w:t>
+      </w:r>
+      <w:r>
+        <w:t>P(y, z)</w:t>
+      </w:r>
+      <w:r>
+        <w:t xml:space="preserve">. Since we are specifying that y does not occur free in F, y essentially takes the place of x in this function with no effect to the meaning of the expression. This can be seen with our example where </w:t>
+      </w:r>
+      <w:r>
+        <w:rPr>
+          <w:rFonts w:ascii="Cambria Math" w:hAnsi="Cambria Math" w:cs="Cambria Math"/>
+        </w:rPr>
+        <w:t>∀</w:t>
+      </w:r>
+      <w:r>
+        <w:t>xF ≡</w:t>
       </w:r>
       <w:r>
         <w:t xml:space="preserve"> </w:t>
@@ -109,33 +185,7 @@
         <w:t>∀</w:t>
       </w:r>
       <w:r>
-        <w:t>x(P (</w:t>
-      </w:r>
-      <w:r>
-        <w:t>a</w:t>
-      </w:r>
-      <w:r>
-        <w:t xml:space="preserve">, </w:t>
-      </w:r>
-      <w:r>
-        <w:t>a</w:t>
-      </w:r>
-      <w:r>
-        <w:t>)))</w:t>
-      </w:r>
-    </w:p>
-    <w:p>
-      <w:r>
-        <w:rPr>
-          <w:b/>
-          <w:bCs/>
-        </w:rPr>
-        <w:t>Exercise 58</w:t>
-      </w:r>
-    </w:p>
-    <w:p>
-      <w:r>
-        <w:t xml:space="preserve">Because of how substitution works, for </w:t>
+        <w:t xml:space="preserve">xP(x, z) and </w:t>
       </w:r>
       <w:r>
         <w:rPr>
@@ -143,16 +193,20 @@
         </w:rPr>
         <w:t>∀</w:t>
       </w:r>
-      <w:proofErr w:type="spellStart"/>
-      <w:r>
-        <w:t>yF</w:t>
-      </w:r>
-      <w:proofErr w:type="spellEnd"/>
-      <w:r>
-        <w:t>[x/y</w:t>
-      </w:r>
-      <w:r>
-        <w:t xml:space="preserve">], any occurrence of x in F will be replaced by y. For example, if F is P(x, z), then </w:t>
+      <w:r>
+        <w:t>y</w:t>
+      </w:r>
+      <w:r>
+        <w:t>F</w:t>
+      </w:r>
+      <w:r>
+        <w:t>[x/y]</w:t>
+      </w:r>
+      <w:r>
+        <w:t xml:space="preserve"> ≡</w:t>
+      </w:r>
+      <w:r>
+        <w:t xml:space="preserve"> </w:t>
       </w:r>
       <w:r>
         <w:rPr>
@@ -160,128 +214,8 @@
         </w:rPr>
         <w:t>∀</w:t>
       </w:r>
-      <w:proofErr w:type="spellStart"/>
-      <w:r>
-        <w:t>yF</w:t>
-      </w:r>
-      <w:proofErr w:type="spellEnd"/>
-      <w:r>
-        <w:t>[x/y</w:t>
-      </w:r>
-      <w:r>
-        <w:t xml:space="preserve">] becomes </w:t>
-      </w:r>
-      <w:r>
-        <w:rPr>
-          <w:rFonts w:ascii="Cambria Math" w:hAnsi="Cambria Math" w:cs="Cambria Math"/>
-        </w:rPr>
-        <w:t>∀</w:t>
-      </w:r>
-      <w:proofErr w:type="spellStart"/>
-      <w:r>
-        <w:t>y</w:t>
-      </w:r>
-      <w:r>
-        <w:t>P</w:t>
-      </w:r>
-      <w:proofErr w:type="spellEnd"/>
-      <w:r>
-        <w:t>(y, z)</w:t>
-      </w:r>
-      <w:r>
-        <w:t xml:space="preserve">. Since we are specifying that y does not occur free in F, y essentially takes the place of x in this function with no effect to the meaning of the expression. This can be seen with our example where </w:t>
-      </w:r>
-      <w:r>
-        <w:rPr>
-          <w:rFonts w:ascii="Cambria Math" w:hAnsi="Cambria Math" w:cs="Cambria Math"/>
-        </w:rPr>
-        <w:t>∀</w:t>
-      </w:r>
-      <w:proofErr w:type="spellStart"/>
-      <w:r>
-        <w:t>xF</w:t>
-      </w:r>
-      <w:proofErr w:type="spellEnd"/>
-      <w:r>
-        <w:t xml:space="preserve"> ≡</w:t>
-      </w:r>
-      <w:r>
-        <w:t xml:space="preserve"> </w:t>
-      </w:r>
-      <w:r>
-        <w:rPr>
-          <w:rFonts w:ascii="Cambria Math" w:hAnsi="Cambria Math" w:cs="Cambria Math"/>
-        </w:rPr>
-        <w:t>∀</w:t>
-      </w:r>
-      <w:proofErr w:type="spellStart"/>
-      <w:r>
-        <w:t>x</w:t>
-      </w:r>
-      <w:r>
-        <w:t>P</w:t>
-      </w:r>
-      <w:proofErr w:type="spellEnd"/>
-      <w:r>
-        <w:t>(</w:t>
-      </w:r>
-      <w:r>
-        <w:t>x</w:t>
-      </w:r>
-      <w:r>
-        <w:t>, z)</w:t>
-      </w:r>
-      <w:r>
-        <w:t xml:space="preserve"> and </w:t>
-      </w:r>
-      <w:r>
-        <w:rPr>
-          <w:rFonts w:ascii="Cambria Math" w:hAnsi="Cambria Math" w:cs="Cambria Math"/>
-        </w:rPr>
-        <w:t>∀</w:t>
-      </w:r>
-      <w:proofErr w:type="spellStart"/>
-      <w:r>
-        <w:t>y</w:t>
-      </w:r>
-      <w:r>
-        <w:t>F</w:t>
-      </w:r>
-      <w:proofErr w:type="spellEnd"/>
-      <w:r>
-        <w:t>[x/y]</w:t>
-      </w:r>
-      <w:r>
-        <w:t xml:space="preserve"> ≡</w:t>
-      </w:r>
-      <w:r>
-        <w:t xml:space="preserve"> </w:t>
-      </w:r>
-      <w:r>
-        <w:rPr>
-          <w:rFonts w:ascii="Cambria Math" w:hAnsi="Cambria Math" w:cs="Cambria Math"/>
-        </w:rPr>
-        <w:t>∀</w:t>
-      </w:r>
-      <w:proofErr w:type="spellStart"/>
-      <w:r>
-        <w:t>y</w:t>
-      </w:r>
-      <w:r>
-        <w:t>P</w:t>
-      </w:r>
-      <w:proofErr w:type="spellEnd"/>
-      <w:r>
-        <w:t>(</w:t>
-      </w:r>
-      <w:r>
-        <w:t>y,</w:t>
-      </w:r>
-      <w:r>
-        <w:t xml:space="preserve"> z)</w:t>
-      </w:r>
-      <w:r>
-        <w:t>. By the logic discussed above, the statement is true.</w:t>
+      <w:r>
+        <w:t>yP(y, z). By the logic discussed above, the statement is true.</w:t>
       </w:r>
     </w:p>
     <w:p>
@@ -382,7 +316,6 @@
         </w:rPr>
         <w:t>∀</w:t>
       </w:r>
-      <w:proofErr w:type="spellStart"/>
       <w:r>
         <w:t>x</w:t>
       </w:r>
@@ -393,11 +326,7 @@
         <w:t>∀</w:t>
       </w:r>
       <w:r>
-        <w:t>y</w:t>
-      </w:r>
-      <w:proofErr w:type="spellEnd"/>
-      <w:r>
-        <w:t xml:space="preserve">(¬O(x, y) </w:t>
+        <w:t xml:space="preserve">y(¬O(x, y) </w:t>
       </w:r>
       <w:r>
         <w:rPr>
@@ -497,15 +426,3075 @@
       </w:r>
     </w:p>
     <w:p>
-      <w:r>
+      <w:pPr>
         <w:rPr>
           <w:b/>
           <w:bCs/>
         </w:rPr>
+      </w:pPr>
+    </w:p>
+    <w:p>
+      <w:pPr>
+        <w:rPr>
+          <w:b/>
+          <w:bCs/>
+        </w:rPr>
+      </w:pPr>
+    </w:p>
+    <w:p>
+      <w:pPr>
+        <w:rPr>
+          <w:b/>
+          <w:bCs/>
+        </w:rPr>
+      </w:pPr>
+    </w:p>
+    <w:p>
+      <w:pPr>
+        <w:rPr>
+          <w:b/>
+          <w:bCs/>
+        </w:rPr>
+      </w:pPr>
+    </w:p>
+    <w:p>
+      <w:pPr>
+        <w:rPr>
+          <w:b/>
+          <w:bCs/>
+        </w:rPr>
+      </w:pPr>
+    </w:p>
+    <w:p>
+      <w:pPr>
+        <w:rPr>
+          <w:b/>
+          <w:bCs/>
+        </w:rPr>
+      </w:pPr>
+      <w:r>
+        <w:rPr>
+          <w:b/>
+          <w:bCs/>
+        </w:rPr>
+        <w:lastRenderedPageBreak/>
         <w:t>Exercise 60</w:t>
       </w:r>
     </w:p>
-    <w:p/>
+    <w:p>
+      <w:pPr>
+        <w:spacing w:line="240" w:lineRule="auto"/>
+        <w:jc w:val="center"/>
+      </w:pPr>
+      <w:r>
+        <w:rPr>
+          <w:rFonts w:ascii="Cambria Math" w:hAnsi="Cambria Math" w:cs="Cambria Math"/>
+        </w:rPr>
+        <w:t>∃</w:t>
+      </w:r>
+      <w:r>
+        <w:t xml:space="preserve">xP(x) </w:t>
+      </w:r>
+      <w:r>
+        <w:rPr>
+          <w:rFonts w:ascii="Cambria Math" w:hAnsi="Cambria Math" w:cs="Cambria Math"/>
+        </w:rPr>
+        <w:t>∧</w:t>
+      </w:r>
+      <w:r>
+        <w:t xml:space="preserve"> </w:t>
+      </w:r>
+      <w:r>
+        <w:rPr>
+          <w:rFonts w:ascii="Cambria Math" w:hAnsi="Cambria Math" w:cs="Cambria Math"/>
+        </w:rPr>
+        <w:t>∃</w:t>
+      </w:r>
+      <w:r>
+        <w:t xml:space="preserve">xQ(x) </w:t>
+      </w:r>
+      <w:r>
+        <w:rPr>
+          <w:rFonts w:ascii="Cambria Math" w:hAnsi="Cambria Math" w:cs="Cambria Math"/>
+        </w:rPr>
+        <w:t>∧</w:t>
+      </w:r>
+      <w:r>
+        <w:t xml:space="preserve"> </w:t>
+      </w:r>
+      <w:r>
+        <w:t>(</w:t>
+      </w:r>
+      <w:r>
+        <w:rPr>
+          <w:rFonts w:ascii="Cambria Math" w:hAnsi="Cambria Math" w:cs="Cambria Math"/>
+        </w:rPr>
+        <w:t>∀</w:t>
+      </w:r>
+      <w:r>
+        <w:t xml:space="preserve">x¬P(x) </w:t>
+      </w:r>
+      <w:r>
+        <w:rPr>
+          <w:rFonts w:ascii="Cambria Math" w:hAnsi="Cambria Math" w:cs="Cambria Math"/>
+        </w:rPr>
+        <w:t>∨</w:t>
+      </w:r>
+      <w:r>
+        <w:rPr>
+          <w:rFonts w:ascii="Cambria Math" w:hAnsi="Cambria Math" w:cs="Cambria Math"/>
+        </w:rPr>
+        <w:t xml:space="preserve"> </w:t>
+      </w:r>
+      <w:r>
+        <w:rPr>
+          <w:rFonts w:ascii="Cambria Math" w:hAnsi="Cambria Math" w:cs="Cambria Math"/>
+        </w:rPr>
+        <w:t>∀</w:t>
+      </w:r>
+      <w:r>
+        <w:t>y¬Q(y)</w:t>
+      </w:r>
+      <w:r>
+        <w:t>)</w:t>
+      </w:r>
+    </w:p>
+    <w:p>
+      <w:pPr>
+        <w:spacing w:line="240" w:lineRule="auto"/>
+        <w:jc w:val="center"/>
+      </w:pPr>
+      <w:r>
+        <w:t>|</w:t>
+      </w:r>
+    </w:p>
+    <w:p>
+      <w:pPr>
+        <w:spacing w:line="240" w:lineRule="auto"/>
+        <w:jc w:val="center"/>
+      </w:pPr>
+      <w:r>
+        <w:rPr>
+          <w:rFonts w:ascii="Cambria Math" w:hAnsi="Cambria Math" w:cs="Cambria Math"/>
+        </w:rPr>
+        <w:t>∃</w:t>
+      </w:r>
+      <w:r>
+        <w:t xml:space="preserve">xP(x) </w:t>
+      </w:r>
+      <w:r>
+        <w:rPr>
+          <w:rFonts w:ascii="Cambria Math" w:hAnsi="Cambria Math" w:cs="Cambria Math"/>
+        </w:rPr>
+        <w:t>∧</w:t>
+      </w:r>
+      <w:r>
+        <w:t xml:space="preserve"> </w:t>
+      </w:r>
+      <w:r>
+        <w:rPr>
+          <w:rFonts w:ascii="Cambria Math" w:hAnsi="Cambria Math" w:cs="Cambria Math"/>
+        </w:rPr>
+        <w:t>∃</w:t>
+      </w:r>
+      <w:r>
+        <w:t>xQ(x)</w:t>
+      </w:r>
+    </w:p>
+    <w:p>
+      <w:pPr>
+        <w:spacing w:line="240" w:lineRule="auto"/>
+        <w:jc w:val="center"/>
+      </w:pPr>
+      <w:r>
+        <w:t>|</w:t>
+      </w:r>
+    </w:p>
+    <w:p>
+      <w:pPr>
+        <w:spacing w:line="240" w:lineRule="auto"/>
+        <w:jc w:val="center"/>
+      </w:pPr>
+      <w:r>
+        <w:rPr>
+          <w:rFonts w:ascii="Cambria Math" w:hAnsi="Cambria Math" w:cs="Cambria Math"/>
+        </w:rPr>
+        <w:t>∃</w:t>
+      </w:r>
+      <w:r>
+        <w:t>xP(x)</w:t>
+      </w:r>
+    </w:p>
+    <w:p>
+      <w:pPr>
+        <w:spacing w:line="240" w:lineRule="auto"/>
+        <w:jc w:val="center"/>
+      </w:pPr>
+      <w:r>
+        <w:t>|</w:t>
+      </w:r>
+    </w:p>
+    <w:p>
+      <w:pPr>
+        <w:spacing w:line="240" w:lineRule="auto"/>
+        <w:jc w:val="center"/>
+      </w:pPr>
+      <w:r>
+        <w:t>P(a)</w:t>
+      </w:r>
+    </w:p>
+    <w:p>
+      <w:pPr>
+        <w:spacing w:line="240" w:lineRule="auto"/>
+        <w:jc w:val="center"/>
+      </w:pPr>
+      <w:r>
+        <w:t>|</w:t>
+      </w:r>
+    </w:p>
+    <w:p>
+      <w:pPr>
+        <w:spacing w:line="240" w:lineRule="auto"/>
+        <w:jc w:val="center"/>
+      </w:pPr>
+      <w:r>
+        <w:rPr>
+          <w:rFonts w:ascii="Cambria Math" w:hAnsi="Cambria Math" w:cs="Cambria Math"/>
+        </w:rPr>
+        <w:t>∃</w:t>
+      </w:r>
+      <w:r>
+        <w:t>xQ(x)</w:t>
+      </w:r>
+    </w:p>
+    <w:p>
+      <w:pPr>
+        <w:spacing w:line="240" w:lineRule="auto"/>
+        <w:jc w:val="center"/>
+      </w:pPr>
+      <w:r>
+        <w:t>|</w:t>
+      </w:r>
+    </w:p>
+    <w:p>
+      <w:pPr>
+        <w:spacing w:line="240" w:lineRule="auto"/>
+        <w:jc w:val="center"/>
+      </w:pPr>
+      <w:r>
+        <w:t>Q(a)</w:t>
+      </w:r>
+    </w:p>
+    <w:p>
+      <w:pPr>
+        <w:spacing w:line="240" w:lineRule="auto"/>
+        <w:jc w:val="center"/>
+      </w:pPr>
+      <w:r>
+        <w:t>|</w:t>
+      </w:r>
+    </w:p>
+    <w:p>
+      <w:pPr>
+        <w:spacing w:line="240" w:lineRule="auto"/>
+        <w:jc w:val="center"/>
+      </w:pPr>
+      <w:r>
+        <w:rPr>
+          <w:rFonts w:ascii="Cambria Math" w:hAnsi="Cambria Math" w:cs="Cambria Math"/>
+        </w:rPr>
+        <w:t>∀</w:t>
+      </w:r>
+      <w:r>
+        <w:t xml:space="preserve">x¬P(x) </w:t>
+      </w:r>
+      <w:r>
+        <w:rPr>
+          <w:rFonts w:ascii="Cambria Math" w:hAnsi="Cambria Math" w:cs="Cambria Math"/>
+        </w:rPr>
+        <w:t>∨</w:t>
+      </w:r>
+      <w:r>
+        <w:rPr>
+          <w:rFonts w:ascii="Cambria Math" w:hAnsi="Cambria Math" w:cs="Cambria Math"/>
+        </w:rPr>
+        <w:t xml:space="preserve"> </w:t>
+      </w:r>
+      <w:r>
+        <w:rPr>
+          <w:rFonts w:ascii="Cambria Math" w:hAnsi="Cambria Math" w:cs="Cambria Math"/>
+        </w:rPr>
+        <w:t>∀</w:t>
+      </w:r>
+      <w:r>
+        <w:t>y¬Q(y)</w:t>
+      </w:r>
+    </w:p>
+    <w:p>
+      <w:pPr>
+        <w:spacing w:line="240" w:lineRule="auto"/>
+        <w:jc w:val="center"/>
+      </w:pPr>
+      <w:r>
+        <w:t>/</w:t>
+      </w:r>
+      <w:r>
+        <w:tab/>
+      </w:r>
+      <w:r>
+        <w:tab/>
+        <w:t>\</w:t>
+      </w:r>
+    </w:p>
+    <w:p>
+      <w:pPr>
+        <w:spacing w:line="240" w:lineRule="auto"/>
+        <w:jc w:val="center"/>
+      </w:pPr>
+      <w:r>
+        <w:rPr>
+          <w:rFonts w:ascii="Cambria Math" w:hAnsi="Cambria Math" w:cs="Cambria Math"/>
+        </w:rPr>
+        <w:t>∀</w:t>
+      </w:r>
+      <w:r>
+        <w:t>x¬P(x)</w:t>
+      </w:r>
+      <w:r>
+        <w:tab/>
+      </w:r>
+      <w:r>
+        <w:rPr>
+          <w:rFonts w:ascii="Cambria Math" w:hAnsi="Cambria Math" w:cs="Cambria Math"/>
+        </w:rPr>
+        <w:t>∀</w:t>
+      </w:r>
+      <w:r>
+        <w:t>y¬Q(y)</w:t>
+      </w:r>
+    </w:p>
+    <w:p>
+      <w:pPr>
+        <w:spacing w:line="240" w:lineRule="auto"/>
+        <w:jc w:val="center"/>
+      </w:pPr>
+      <w:r>
+        <w:t>|</w:t>
+      </w:r>
+      <w:r>
+        <w:tab/>
+      </w:r>
+      <w:r>
+        <w:tab/>
+        <w:t xml:space="preserve">  |</w:t>
+      </w:r>
+    </w:p>
+    <w:p>
+      <w:pPr>
+        <w:spacing w:line="240" w:lineRule="auto"/>
+        <w:jc w:val="center"/>
+      </w:pPr>
+      <w:r>
+        <w:t>¬P(</w:t>
+      </w:r>
+      <w:r>
+        <w:t>a</w:t>
+      </w:r>
+      <w:r>
+        <w:t>)</w:t>
+      </w:r>
+      <w:r>
+        <w:tab/>
+      </w:r>
+      <w:r>
+        <w:tab/>
+      </w:r>
+      <w:r>
+        <w:t>¬</w:t>
+      </w:r>
+      <w:r>
+        <w:t>Q</w:t>
+      </w:r>
+      <w:r>
+        <w:t>(</w:t>
+      </w:r>
+      <w:r>
+        <w:t>a</w:t>
+      </w:r>
+      <w:r>
+        <w:t>)</w:t>
+      </w:r>
+    </w:p>
+    <w:p>
+      <w:pPr>
+        <w:spacing w:line="240" w:lineRule="auto"/>
+        <w:jc w:val="center"/>
+      </w:pPr>
+      <w:r>
+        <w:t>|</w:t>
+      </w:r>
+      <w:r>
+        <w:tab/>
+      </w:r>
+      <w:r>
+        <w:tab/>
+        <w:t xml:space="preserve">  |</w:t>
+      </w:r>
+    </w:p>
+    <w:p>
+      <w:pPr>
+        <w:spacing w:line="240" w:lineRule="auto"/>
+        <w:jc w:val="center"/>
+      </w:pPr>
+      <w:r>
+        <w:t>CLOSED</w:t>
+      </w:r>
+      <w:r>
+        <w:tab/>
+        <w:t xml:space="preserve">  CLOSED</w:t>
+      </w:r>
+    </w:p>
+    <w:p>
+      <w:pPr>
+        <w:spacing w:line="240" w:lineRule="auto"/>
+      </w:pPr>
+    </w:p>
+    <w:p>
+      <w:pPr>
+        <w:spacing w:line="240" w:lineRule="auto"/>
+        <w:rPr>
+          <w:b/>
+          <w:bCs/>
+        </w:rPr>
+      </w:pPr>
+      <w:r>
+        <w:rPr>
+          <w:b/>
+          <w:bCs/>
+        </w:rPr>
+        <w:t>Exercise 61</w:t>
+      </w:r>
+    </w:p>
+    <w:p>
+      <w:pPr>
+        <w:spacing w:line="240" w:lineRule="auto"/>
+        <w:rPr>
+          <w:b/>
+          <w:bCs/>
+        </w:rPr>
+      </w:pPr>
+    </w:p>
+    <w:p>
+      <w:pPr>
+        <w:spacing w:line="240" w:lineRule="auto"/>
+      </w:pPr>
+      <w:r>
+        <w:rPr>
+          <w:rFonts w:ascii="Cambria Math" w:hAnsi="Cambria Math" w:cs="Cambria Math"/>
+        </w:rPr>
+        <w:t>¬∃</w:t>
+      </w:r>
+      <w:r>
+        <w:t>x(O(s, x)</w:t>
+      </w:r>
+      <w:r>
+        <w:t xml:space="preserve"> </w:t>
+      </w:r>
+      <w:r>
+        <w:rPr>
+          <w:rFonts w:ascii="Cambria Math" w:hAnsi="Cambria Math" w:cs="Cambria Math"/>
+        </w:rPr>
+        <w:t>∧</w:t>
+      </w:r>
+      <w:r>
+        <w:rPr>
+          <w:rFonts w:ascii="Cambria Math" w:hAnsi="Cambria Math" w:cs="Cambria Math"/>
+        </w:rPr>
+        <w:t xml:space="preserve"> </w:t>
+      </w:r>
+      <w:r>
+        <w:t>A(x))</w:t>
+      </w:r>
+      <w:r>
+        <w:t xml:space="preserve"> = </w:t>
+      </w:r>
+      <w:r>
+        <w:rPr>
+          <w:rFonts w:ascii="Cambria Math" w:hAnsi="Cambria Math" w:cs="Cambria Math"/>
+        </w:rPr>
+        <w:t>∀</w:t>
+      </w:r>
+      <w:r>
+        <w:rPr>
+          <w:rFonts w:ascii="Cambria Math" w:hAnsi="Cambria Math" w:cs="Cambria Math"/>
+        </w:rPr>
+        <w:t>x(</w:t>
+      </w:r>
+      <w:r>
+        <w:rPr>
+          <w:rFonts w:ascii="Cambria Math" w:hAnsi="Cambria Math" w:cs="Cambria Math"/>
+        </w:rPr>
+        <w:t>¬</w:t>
+      </w:r>
+      <w:r>
+        <w:t>O(s, x)</w:t>
+      </w:r>
+      <w:r>
+        <w:t xml:space="preserve"> </w:t>
+      </w:r>
+      <w:r>
+        <w:rPr>
+          <w:rFonts w:ascii="Cambria Math" w:hAnsi="Cambria Math" w:cs="Cambria Math"/>
+        </w:rPr>
+        <w:t>∨</w:t>
+      </w:r>
+      <w:r>
+        <w:rPr>
+          <w:rFonts w:ascii="Cambria Math" w:hAnsi="Cambria Math" w:cs="Cambria Math"/>
+        </w:rPr>
+        <w:t xml:space="preserve"> </w:t>
+      </w:r>
+      <w:r>
+        <w:rPr>
+          <w:rFonts w:ascii="Cambria Math" w:hAnsi="Cambria Math" w:cs="Cambria Math"/>
+        </w:rPr>
+        <w:t>¬</w:t>
+      </w:r>
+      <w:r>
+        <w:t>A(x)</w:t>
+      </w:r>
+      <w:r>
+        <w:t>)</w:t>
+      </w:r>
+    </w:p>
+    <w:p>
+      <w:pPr>
+        <w:spacing w:line="240" w:lineRule="auto"/>
+      </w:pPr>
+    </w:p>
+    <w:p>
+      <w:pPr>
+        <w:spacing w:line="240" w:lineRule="auto"/>
+      </w:pPr>
+      <w:r>
+        <w:t>Below are 1-5 in NNF:</w:t>
+      </w:r>
+      <w:r>
+        <w:br/>
+        <w:t xml:space="preserve">1. </w:t>
+      </w:r>
+      <w:r>
+        <w:rPr>
+          <w:rFonts w:ascii="Cambria Math" w:hAnsi="Cambria Math" w:cs="Cambria Math"/>
+        </w:rPr>
+        <w:t>∀</w:t>
+      </w:r>
+      <w:r>
+        <w:t xml:space="preserve">x(¬H(x) </w:t>
+      </w:r>
+      <w:r>
+        <w:rPr>
+          <w:rFonts w:ascii="Cambria Math" w:hAnsi="Cambria Math" w:cs="Cambria Math"/>
+        </w:rPr>
+        <w:t>∨</w:t>
+      </w:r>
+      <w:r>
+        <w:t xml:space="preserve"> </w:t>
+      </w:r>
+      <w:r>
+        <w:t>¬D(x))</w:t>
+      </w:r>
+    </w:p>
+    <w:p>
+      <w:pPr>
+        <w:spacing w:line="240" w:lineRule="auto"/>
+      </w:pPr>
+      <w:r>
+        <w:rPr>
+          <w:rFonts w:ascii="Cambria Math" w:hAnsi="Cambria Math" w:cs="Cambria Math"/>
+        </w:rPr>
+        <w:t xml:space="preserve">2. </w:t>
+      </w:r>
+      <w:r>
+        <w:rPr>
+          <w:rFonts w:ascii="Cambria Math" w:hAnsi="Cambria Math" w:cs="Cambria Math"/>
+        </w:rPr>
+        <w:t>∀</w:t>
+      </w:r>
+      <w:r>
+        <w:t>x</w:t>
+      </w:r>
+      <w:r>
+        <w:t>(¬</w:t>
+      </w:r>
+      <w:r>
+        <w:t xml:space="preserve">C(x) </w:t>
+      </w:r>
+      <w:r>
+        <w:rPr>
+          <w:rFonts w:ascii="Cambria Math" w:hAnsi="Cambria Math" w:cs="Cambria Math"/>
+        </w:rPr>
+        <w:t>∨</w:t>
+      </w:r>
+      <w:r>
+        <w:t xml:space="preserve"> (A(x) </w:t>
+      </w:r>
+      <w:r>
+        <w:rPr>
+          <w:rFonts w:ascii="Cambria Math" w:hAnsi="Cambria Math" w:cs="Cambria Math"/>
+        </w:rPr>
+        <w:t>∨</w:t>
+      </w:r>
+      <w:r>
+        <w:t xml:space="preserve"> D(x)))</w:t>
+      </w:r>
+    </w:p>
+    <w:p>
+      <w:pPr>
+        <w:spacing w:line="240" w:lineRule="auto"/>
+      </w:pPr>
+      <w:r>
+        <w:t xml:space="preserve">3. </w:t>
+      </w:r>
+      <w:r>
+        <w:rPr>
+          <w:rFonts w:ascii="Cambria Math" w:hAnsi="Cambria Math" w:cs="Cambria Math"/>
+        </w:rPr>
+        <w:t>∀</w:t>
+      </w:r>
+      <w:r>
+        <w:t>x</w:t>
+      </w:r>
+      <w:r>
+        <w:rPr>
+          <w:rFonts w:ascii="Cambria Math" w:hAnsi="Cambria Math" w:cs="Cambria Math"/>
+        </w:rPr>
+        <w:t>∀</w:t>
+      </w:r>
+      <w:r>
+        <w:t xml:space="preserve">y(¬O(x, y) </w:t>
+      </w:r>
+      <w:r>
+        <w:rPr>
+          <w:rFonts w:ascii="Cambria Math" w:hAnsi="Cambria Math" w:cs="Cambria Math"/>
+        </w:rPr>
+        <w:t>∨</w:t>
+      </w:r>
+      <w:r>
+        <w:t xml:space="preserve"> R(x, y))</w:t>
+      </w:r>
+    </w:p>
+    <w:p>
+      <w:pPr>
+        <w:spacing w:line="240" w:lineRule="auto"/>
+      </w:pPr>
+      <w:r>
+        <w:t xml:space="preserve">4. </w:t>
+      </w:r>
+      <w:r>
+        <w:rPr>
+          <w:rFonts w:ascii="Cambria Math" w:hAnsi="Cambria Math" w:cs="Cambria Math"/>
+        </w:rPr>
+        <w:t>∀</w:t>
+      </w:r>
+      <w:r>
+        <w:t xml:space="preserve">x(¬P(x) </w:t>
+      </w:r>
+      <w:r>
+        <w:rPr>
+          <w:rFonts w:ascii="Cambria Math" w:hAnsi="Cambria Math" w:cs="Cambria Math"/>
+        </w:rPr>
+        <w:t>∨</w:t>
+      </w:r>
+      <w:r>
+        <w:t xml:space="preserve"> (</w:t>
+      </w:r>
+      <w:r>
+        <w:rPr>
+          <w:rFonts w:ascii="Cambria Math" w:hAnsi="Cambria Math" w:cs="Cambria Math"/>
+        </w:rPr>
+        <w:t>∃</w:t>
+      </w:r>
+      <w:r>
+        <w:t xml:space="preserve">y(O(x, y) </w:t>
+      </w:r>
+      <w:r>
+        <w:rPr>
+          <w:rFonts w:ascii="Cambria Math" w:hAnsi="Cambria Math" w:cs="Cambria Math"/>
+        </w:rPr>
+        <w:t>∧</w:t>
+      </w:r>
+      <w:r>
+        <w:t xml:space="preserve"> C(y)) </w:t>
+      </w:r>
+      <w:r>
+        <w:rPr>
+          <w:rFonts w:ascii="Cambria Math" w:hAnsi="Cambria Math" w:cs="Cambria Math"/>
+        </w:rPr>
+        <w:t>∧</w:t>
+      </w:r>
+      <w:r>
+        <w:t xml:space="preserve"> (</w:t>
+      </w:r>
+      <w:r>
+        <w:rPr>
+          <w:rFonts w:ascii="Cambria Math" w:hAnsi="Cambria Math" w:cs="Cambria Math"/>
+        </w:rPr>
+        <w:t>∀</w:t>
+      </w:r>
+      <w:r>
+        <w:t>y(</w:t>
+      </w:r>
+      <w:r>
+        <w:t>¬</w:t>
+      </w:r>
+      <w:r>
+        <w:t>R(x, y)</w:t>
+      </w:r>
+      <w:r>
+        <w:rPr>
+          <w:rFonts w:ascii="Cambria Math" w:hAnsi="Cambria Math" w:cs="Cambria Math"/>
+          <w:kern w:val="0"/>
+          <w14:ligatures w14:val="none"/>
+        </w:rPr>
+        <w:t xml:space="preserve"> </w:t>
+      </w:r>
+      <w:r>
+        <w:rPr>
+          <w:rFonts w:ascii="Cambria Math" w:hAnsi="Cambria Math" w:cs="Cambria Math"/>
+        </w:rPr>
+        <w:t>∨</w:t>
+      </w:r>
+      <w:r>
+        <w:t xml:space="preserve"> H(y)))))</w:t>
+      </w:r>
+    </w:p>
+    <w:p>
+      <w:pPr>
+        <w:spacing w:line="240" w:lineRule="auto"/>
+      </w:pPr>
+      <w:r>
+        <w:t>5. P(s)</w:t>
+      </w:r>
+    </w:p>
+    <w:p>
+      <w:pPr>
+        <w:spacing w:line="240" w:lineRule="auto"/>
+        <w:jc w:val="center"/>
+        <w:rPr>
+          <w:rFonts w:ascii="Cambria Math" w:hAnsi="Cambria Math" w:cs="Cambria Math"/>
+        </w:rPr>
+      </w:pPr>
+    </w:p>
+    <w:p>
+      <w:pPr>
+        <w:spacing w:line="240" w:lineRule="auto"/>
+        <w:jc w:val="center"/>
+      </w:pPr>
+    </w:p>
+    <w:p>
+      <w:pPr>
+        <w:spacing w:line="240" w:lineRule="auto"/>
+        <w:jc w:val="center"/>
+      </w:pPr>
+      <w:r>
+        <w:rPr>
+          <w:rFonts w:ascii="Cambria Math" w:hAnsi="Cambria Math" w:cs="Cambria Math"/>
+        </w:rPr>
+        <w:t xml:space="preserve">1. </w:t>
+      </w:r>
+      <w:r>
+        <w:rPr>
+          <w:rFonts w:ascii="Cambria Math" w:hAnsi="Cambria Math" w:cs="Cambria Math"/>
+        </w:rPr>
+        <w:t>∀</w:t>
+      </w:r>
+      <w:r>
+        <w:t xml:space="preserve">x(¬H(x) </w:t>
+      </w:r>
+      <w:r>
+        <w:rPr>
+          <w:rFonts w:ascii="Cambria Math" w:hAnsi="Cambria Math" w:cs="Cambria Math"/>
+        </w:rPr>
+        <w:t>∨</w:t>
+      </w:r>
+      <w:r>
+        <w:t xml:space="preserve"> </w:t>
+      </w:r>
+      <w:r>
+        <w:t>¬D(x))</w:t>
+      </w:r>
+    </w:p>
+    <w:p>
+      <w:pPr>
+        <w:spacing w:line="240" w:lineRule="auto"/>
+        <w:jc w:val="center"/>
+      </w:pPr>
+      <w:r>
+        <w:t>|</w:t>
+      </w:r>
+    </w:p>
+    <w:p>
+      <w:pPr>
+        <w:spacing w:line="240" w:lineRule="auto"/>
+        <w:jc w:val="center"/>
+      </w:pPr>
+      <w:r>
+        <w:rPr>
+          <w:rFonts w:ascii="Cambria Math" w:hAnsi="Cambria Math" w:cs="Cambria Math"/>
+        </w:rPr>
+        <w:t xml:space="preserve">2. </w:t>
+      </w:r>
+      <w:r>
+        <w:rPr>
+          <w:rFonts w:ascii="Cambria Math" w:hAnsi="Cambria Math" w:cs="Cambria Math"/>
+        </w:rPr>
+        <w:t>∀</w:t>
+      </w:r>
+      <w:r>
+        <w:t>x</w:t>
+      </w:r>
+      <w:r>
+        <w:t>(¬</w:t>
+      </w:r>
+      <w:r>
+        <w:t xml:space="preserve">C(x) </w:t>
+      </w:r>
+      <w:r>
+        <w:rPr>
+          <w:rFonts w:ascii="Cambria Math" w:hAnsi="Cambria Math" w:cs="Cambria Math"/>
+        </w:rPr>
+        <w:t>∨</w:t>
+      </w:r>
+      <w:r>
+        <w:t xml:space="preserve"> (A(x) </w:t>
+      </w:r>
+      <w:r>
+        <w:rPr>
+          <w:rFonts w:ascii="Cambria Math" w:hAnsi="Cambria Math" w:cs="Cambria Math"/>
+        </w:rPr>
+        <w:t>∨</w:t>
+      </w:r>
+      <w:r>
+        <w:t xml:space="preserve"> D(x)))</w:t>
+      </w:r>
+    </w:p>
+    <w:p>
+      <w:pPr>
+        <w:spacing w:line="240" w:lineRule="auto"/>
+        <w:jc w:val="center"/>
+      </w:pPr>
+      <w:r>
+        <w:t>|</w:t>
+      </w:r>
+    </w:p>
+    <w:p>
+      <w:pPr>
+        <w:spacing w:line="240" w:lineRule="auto"/>
+        <w:jc w:val="center"/>
+      </w:pPr>
+      <w:r>
+        <w:t xml:space="preserve">3. </w:t>
+      </w:r>
+      <w:r>
+        <w:rPr>
+          <w:rFonts w:ascii="Cambria Math" w:hAnsi="Cambria Math" w:cs="Cambria Math"/>
+        </w:rPr>
+        <w:t>∀</w:t>
+      </w:r>
+      <w:r>
+        <w:t>x</w:t>
+      </w:r>
+      <w:r>
+        <w:rPr>
+          <w:rFonts w:ascii="Cambria Math" w:hAnsi="Cambria Math" w:cs="Cambria Math"/>
+        </w:rPr>
+        <w:t>∀</w:t>
+      </w:r>
+      <w:r>
+        <w:t xml:space="preserve">y(¬O(x, y) </w:t>
+      </w:r>
+      <w:r>
+        <w:rPr>
+          <w:rFonts w:ascii="Cambria Math" w:hAnsi="Cambria Math" w:cs="Cambria Math"/>
+        </w:rPr>
+        <w:t>∨</w:t>
+      </w:r>
+      <w:r>
+        <w:t xml:space="preserve"> R(x, y))</w:t>
+      </w:r>
+    </w:p>
+    <w:p>
+      <w:pPr>
+        <w:spacing w:line="240" w:lineRule="auto"/>
+        <w:jc w:val="center"/>
+      </w:pPr>
+      <w:r>
+        <w:t>|</w:t>
+      </w:r>
+    </w:p>
+    <w:p>
+      <w:pPr>
+        <w:spacing w:line="240" w:lineRule="auto"/>
+        <w:jc w:val="center"/>
+      </w:pPr>
+      <w:r>
+        <w:t xml:space="preserve">4. </w:t>
+      </w:r>
+      <w:r>
+        <w:rPr>
+          <w:rFonts w:ascii="Cambria Math" w:hAnsi="Cambria Math" w:cs="Cambria Math"/>
+        </w:rPr>
+        <w:t>∀</w:t>
+      </w:r>
+      <w:r>
+        <w:t xml:space="preserve">x(¬P(x) </w:t>
+      </w:r>
+      <w:r>
+        <w:rPr>
+          <w:rFonts w:ascii="Cambria Math" w:hAnsi="Cambria Math" w:cs="Cambria Math"/>
+        </w:rPr>
+        <w:t>∨</w:t>
+      </w:r>
+      <w:r>
+        <w:t xml:space="preserve"> (</w:t>
+      </w:r>
+      <w:r>
+        <w:rPr>
+          <w:rFonts w:ascii="Cambria Math" w:hAnsi="Cambria Math" w:cs="Cambria Math"/>
+        </w:rPr>
+        <w:t>∃</w:t>
+      </w:r>
+      <w:r>
+        <w:t xml:space="preserve">y(O(x, y) </w:t>
+      </w:r>
+      <w:r>
+        <w:rPr>
+          <w:rFonts w:ascii="Cambria Math" w:hAnsi="Cambria Math" w:cs="Cambria Math"/>
+        </w:rPr>
+        <w:t>∧</w:t>
+      </w:r>
+      <w:r>
+        <w:t xml:space="preserve"> C(y)) </w:t>
+      </w:r>
+      <w:r>
+        <w:rPr>
+          <w:rFonts w:ascii="Cambria Math" w:hAnsi="Cambria Math" w:cs="Cambria Math"/>
+        </w:rPr>
+        <w:t>∧</w:t>
+      </w:r>
+      <w:r>
+        <w:t xml:space="preserve"> (</w:t>
+      </w:r>
+      <w:r>
+        <w:rPr>
+          <w:rFonts w:ascii="Cambria Math" w:hAnsi="Cambria Math" w:cs="Cambria Math"/>
+        </w:rPr>
+        <w:t>∀</w:t>
+      </w:r>
+      <w:r>
+        <w:t>y(</w:t>
+      </w:r>
+      <w:r>
+        <w:t>¬</w:t>
+      </w:r>
+      <w:r>
+        <w:t>R(x, y)</w:t>
+      </w:r>
+      <w:r>
+        <w:rPr>
+          <w:rFonts w:ascii="Cambria Math" w:hAnsi="Cambria Math" w:cs="Cambria Math"/>
+          <w:kern w:val="0"/>
+          <w14:ligatures w14:val="none"/>
+        </w:rPr>
+        <w:t xml:space="preserve"> </w:t>
+      </w:r>
+      <w:r>
+        <w:rPr>
+          <w:rFonts w:ascii="Cambria Math" w:hAnsi="Cambria Math" w:cs="Cambria Math"/>
+        </w:rPr>
+        <w:t>∨</w:t>
+      </w:r>
+      <w:r>
+        <w:t xml:space="preserve"> H(y)))))</w:t>
+      </w:r>
+    </w:p>
+    <w:p>
+      <w:pPr>
+        <w:spacing w:line="240" w:lineRule="auto"/>
+        <w:jc w:val="center"/>
+      </w:pPr>
+      <w:r>
+        <w:t>|</w:t>
+      </w:r>
+    </w:p>
+    <w:p>
+      <w:pPr>
+        <w:spacing w:line="240" w:lineRule="auto"/>
+        <w:jc w:val="center"/>
+      </w:pPr>
+      <w:r>
+        <w:t xml:space="preserve">5. </w:t>
+      </w:r>
+      <w:r>
+        <w:t>P(s)</w:t>
+      </w:r>
+    </w:p>
+    <w:p>
+      <w:pPr>
+        <w:spacing w:line="240" w:lineRule="auto"/>
+        <w:jc w:val="center"/>
+      </w:pPr>
+      <w:r>
+        <w:t>|</w:t>
+      </w:r>
+    </w:p>
+    <w:p>
+      <w:pPr>
+        <w:spacing w:line="240" w:lineRule="auto"/>
+        <w:jc w:val="center"/>
+      </w:pPr>
+      <w:r>
+        <w:rPr>
+          <w:rFonts w:ascii="Cambria Math" w:hAnsi="Cambria Math" w:cs="Cambria Math"/>
+        </w:rPr>
+        <w:t xml:space="preserve">6. </w:t>
+      </w:r>
+      <w:r>
+        <w:rPr>
+          <w:rFonts w:ascii="Cambria Math" w:hAnsi="Cambria Math" w:cs="Cambria Math"/>
+        </w:rPr>
+        <w:t>∀x(¬</w:t>
+      </w:r>
+      <w:r>
+        <w:t>O(s, x)</w:t>
+      </w:r>
+      <w:r>
+        <w:t xml:space="preserve"> </w:t>
+      </w:r>
+      <w:r>
+        <w:rPr>
+          <w:rFonts w:ascii="Cambria Math" w:hAnsi="Cambria Math" w:cs="Cambria Math"/>
+        </w:rPr>
+        <w:t>∨ ¬</w:t>
+      </w:r>
+      <w:r>
+        <w:t>A(x)</w:t>
+      </w:r>
+      <w:r>
+        <w:t>)</w:t>
+      </w:r>
+    </w:p>
+    <w:p>
+      <w:pPr>
+        <w:spacing w:line="240" w:lineRule="auto"/>
+        <w:jc w:val="center"/>
+      </w:pPr>
+      <w:r>
+        <w:t>|</w:t>
+      </w:r>
+    </w:p>
+    <w:p>
+      <w:pPr>
+        <w:spacing w:line="240" w:lineRule="auto"/>
+        <w:jc w:val="center"/>
+      </w:pPr>
+      <w:r>
+        <w:lastRenderedPageBreak/>
+        <w:t>7.</w:t>
+      </w:r>
+      <w:r>
+        <w:t xml:space="preserve"> </w:t>
+      </w:r>
+      <w:r>
+        <w:t>¬H(</w:t>
+      </w:r>
+      <w:r>
+        <w:t>a</w:t>
+      </w:r>
+      <w:r>
+        <w:t xml:space="preserve">) </w:t>
+      </w:r>
+      <w:r>
+        <w:rPr>
+          <w:rFonts w:ascii="Cambria Math" w:hAnsi="Cambria Math" w:cs="Cambria Math"/>
+        </w:rPr>
+        <w:t>∨</w:t>
+      </w:r>
+      <w:r>
+        <w:t xml:space="preserve"> </w:t>
+      </w:r>
+      <w:r>
+        <w:t>¬D(</w:t>
+      </w:r>
+      <w:r>
+        <w:t>a</w:t>
+      </w:r>
+      <w:r>
+        <w:t>)</w:t>
+      </w:r>
+      <w:r>
+        <w:t xml:space="preserve"> (from 1)</w:t>
+      </w:r>
+    </w:p>
+    <w:p>
+      <w:pPr>
+        <w:spacing w:line="240" w:lineRule="auto"/>
+        <w:jc w:val="center"/>
+      </w:pPr>
+      <w:r>
+        <w:t>|</w:t>
+      </w:r>
+    </w:p>
+    <w:p>
+      <w:pPr>
+        <w:spacing w:line="240" w:lineRule="auto"/>
+        <w:jc w:val="center"/>
+      </w:pPr>
+      <w:r>
+        <w:rPr>
+          <w:rFonts w:ascii="Cambria Math" w:hAnsi="Cambria Math" w:cs="Cambria Math"/>
+        </w:rPr>
+        <w:t>8</w:t>
+      </w:r>
+      <w:r>
+        <w:rPr>
+          <w:rFonts w:ascii="Cambria Math" w:hAnsi="Cambria Math" w:cs="Cambria Math"/>
+        </w:rPr>
+        <w:t xml:space="preserve">. </w:t>
+      </w:r>
+      <w:r>
+        <w:t>¬</w:t>
+      </w:r>
+      <w:r>
+        <w:t>C(</w:t>
+      </w:r>
+      <w:r>
+        <w:t>a</w:t>
+      </w:r>
+      <w:r>
+        <w:t xml:space="preserve">) </w:t>
+      </w:r>
+      <w:r>
+        <w:rPr>
+          <w:rFonts w:ascii="Cambria Math" w:hAnsi="Cambria Math" w:cs="Cambria Math"/>
+        </w:rPr>
+        <w:t>∨</w:t>
+      </w:r>
+      <w:r>
+        <w:t xml:space="preserve"> A(</w:t>
+      </w:r>
+      <w:r>
+        <w:t>a</w:t>
+      </w:r>
+      <w:r>
+        <w:t xml:space="preserve">) </w:t>
+      </w:r>
+      <w:r>
+        <w:rPr>
+          <w:rFonts w:ascii="Cambria Math" w:hAnsi="Cambria Math" w:cs="Cambria Math"/>
+        </w:rPr>
+        <w:t>∨</w:t>
+      </w:r>
+      <w:r>
+        <w:t xml:space="preserve"> D(</w:t>
+      </w:r>
+      <w:r>
+        <w:t>a</w:t>
+      </w:r>
+      <w:r>
+        <w:t>)</w:t>
+      </w:r>
+      <w:r>
+        <w:t xml:space="preserve"> (from 2)</w:t>
+      </w:r>
+    </w:p>
+    <w:p>
+      <w:pPr>
+        <w:spacing w:line="240" w:lineRule="auto"/>
+        <w:jc w:val="center"/>
+      </w:pPr>
+      <w:r>
+        <w:t>|</w:t>
+      </w:r>
+    </w:p>
+    <w:p>
+      <w:pPr>
+        <w:spacing w:line="240" w:lineRule="auto"/>
+        <w:jc w:val="center"/>
+      </w:pPr>
+      <w:r>
+        <w:t>9</w:t>
+      </w:r>
+      <w:r>
+        <w:t xml:space="preserve">. </w:t>
+      </w:r>
+      <w:r>
+        <w:t>¬O(</w:t>
+      </w:r>
+      <w:r>
+        <w:t>s</w:t>
+      </w:r>
+      <w:r>
+        <w:t>,</w:t>
+      </w:r>
+      <w:r>
+        <w:t xml:space="preserve"> a</w:t>
+      </w:r>
+      <w:r>
+        <w:t xml:space="preserve">) </w:t>
+      </w:r>
+      <w:r>
+        <w:rPr>
+          <w:rFonts w:ascii="Cambria Math" w:hAnsi="Cambria Math" w:cs="Cambria Math"/>
+        </w:rPr>
+        <w:t>∨</w:t>
+      </w:r>
+      <w:r>
+        <w:t xml:space="preserve"> R(</w:t>
+      </w:r>
+      <w:r>
+        <w:t>s</w:t>
+      </w:r>
+      <w:r>
+        <w:t xml:space="preserve">, </w:t>
+      </w:r>
+      <w:r>
+        <w:t>a</w:t>
+      </w:r>
+      <w:r>
+        <w:t>)</w:t>
+      </w:r>
+      <w:r>
+        <w:t xml:space="preserve"> (from 3)</w:t>
+      </w:r>
+    </w:p>
+    <w:p>
+      <w:pPr>
+        <w:spacing w:line="240" w:lineRule="auto"/>
+        <w:jc w:val="center"/>
+      </w:pPr>
+      <w:r>
+        <w:t>|</w:t>
+      </w:r>
+    </w:p>
+    <w:p>
+      <w:pPr>
+        <w:spacing w:line="240" w:lineRule="auto"/>
+        <w:jc w:val="center"/>
+      </w:pPr>
+      <w:r>
+        <w:t>1</w:t>
+      </w:r>
+      <w:r>
+        <w:t>0</w:t>
+      </w:r>
+      <w:r>
+        <w:t xml:space="preserve">. </w:t>
+      </w:r>
+      <w:r>
+        <w:t>¬P(</w:t>
+      </w:r>
+      <w:r>
+        <w:t>s</w:t>
+      </w:r>
+      <w:r>
+        <w:t xml:space="preserve">) </w:t>
+      </w:r>
+      <w:r>
+        <w:rPr>
+          <w:rFonts w:ascii="Cambria Math" w:hAnsi="Cambria Math" w:cs="Cambria Math"/>
+        </w:rPr>
+        <w:t>∨</w:t>
+      </w:r>
+      <w:r>
+        <w:t xml:space="preserve"> (</w:t>
+      </w:r>
+      <w:r>
+        <w:rPr>
+          <w:rFonts w:ascii="Cambria Math" w:hAnsi="Cambria Math" w:cs="Cambria Math"/>
+        </w:rPr>
+        <w:t>∃</w:t>
+      </w:r>
+      <w:r>
+        <w:t>y(O(</w:t>
+      </w:r>
+      <w:r>
+        <w:t>s</w:t>
+      </w:r>
+      <w:r>
+        <w:t xml:space="preserve">, y) </w:t>
+      </w:r>
+      <w:r>
+        <w:rPr>
+          <w:rFonts w:ascii="Cambria Math" w:hAnsi="Cambria Math" w:cs="Cambria Math"/>
+        </w:rPr>
+        <w:t>∧</w:t>
+      </w:r>
+      <w:r>
+        <w:t xml:space="preserve"> C(y)) </w:t>
+      </w:r>
+      <w:r>
+        <w:rPr>
+          <w:rFonts w:ascii="Cambria Math" w:hAnsi="Cambria Math" w:cs="Cambria Math"/>
+        </w:rPr>
+        <w:t>∧</w:t>
+      </w:r>
+      <w:r>
+        <w:t xml:space="preserve"> (</w:t>
+      </w:r>
+      <w:r>
+        <w:rPr>
+          <w:rFonts w:ascii="Cambria Math" w:hAnsi="Cambria Math" w:cs="Cambria Math"/>
+        </w:rPr>
+        <w:t>∀</w:t>
+      </w:r>
+      <w:r>
+        <w:t>y(</w:t>
+      </w:r>
+      <w:r>
+        <w:t>¬</w:t>
+      </w:r>
+      <w:r>
+        <w:t>R(</w:t>
+      </w:r>
+      <w:r>
+        <w:t>s</w:t>
+      </w:r>
+      <w:r>
+        <w:t>, y)</w:t>
+      </w:r>
+      <w:r>
+        <w:rPr>
+          <w:rFonts w:ascii="Cambria Math" w:hAnsi="Cambria Math" w:cs="Cambria Math"/>
+          <w:kern w:val="0"/>
+          <w14:ligatures w14:val="none"/>
+        </w:rPr>
+        <w:t xml:space="preserve"> </w:t>
+      </w:r>
+      <w:r>
+        <w:rPr>
+          <w:rFonts w:ascii="Cambria Math" w:hAnsi="Cambria Math" w:cs="Cambria Math"/>
+        </w:rPr>
+        <w:t>∨</w:t>
+      </w:r>
+      <w:r>
+        <w:t xml:space="preserve"> H(y))))</w:t>
+      </w:r>
+      <w:r>
+        <w:t xml:space="preserve"> (from 4)</w:t>
+      </w:r>
+    </w:p>
+    <w:p>
+      <w:pPr>
+        <w:spacing w:line="240" w:lineRule="auto"/>
+        <w:jc w:val="center"/>
+        <w:rPr>
+          <w:rFonts w:ascii="Cambria Math" w:hAnsi="Cambria Math" w:cs="Cambria Math"/>
+        </w:rPr>
+      </w:pPr>
+      <w:r>
+        <w:rPr>
+          <w:rFonts w:ascii="Cambria Math" w:hAnsi="Cambria Math" w:cs="Cambria Math"/>
+        </w:rPr>
+        <w:t>|</w:t>
+      </w:r>
+    </w:p>
+    <w:p>
+      <w:pPr>
+        <w:spacing w:line="240" w:lineRule="auto"/>
+        <w:jc w:val="center"/>
+      </w:pPr>
+      <w:r>
+        <w:rPr>
+          <w:rFonts w:ascii="Cambria Math" w:hAnsi="Cambria Math" w:cs="Cambria Math"/>
+        </w:rPr>
+        <w:t>1</w:t>
+      </w:r>
+      <w:r>
+        <w:rPr>
+          <w:rFonts w:ascii="Cambria Math" w:hAnsi="Cambria Math" w:cs="Cambria Math"/>
+        </w:rPr>
+        <w:t>1</w:t>
+      </w:r>
+      <w:r>
+        <w:rPr>
+          <w:rFonts w:ascii="Cambria Math" w:hAnsi="Cambria Math" w:cs="Cambria Math"/>
+        </w:rPr>
+        <w:t xml:space="preserve">. </w:t>
+      </w:r>
+      <w:r>
+        <w:rPr>
+          <w:rFonts w:ascii="Cambria Math" w:hAnsi="Cambria Math" w:cs="Cambria Math"/>
+        </w:rPr>
+        <w:t>∃</w:t>
+      </w:r>
+      <w:r>
+        <w:t>y(O(</w:t>
+      </w:r>
+      <w:r>
+        <w:t>s</w:t>
+      </w:r>
+      <w:r>
+        <w:t xml:space="preserve">, y) </w:t>
+      </w:r>
+      <w:r>
+        <w:rPr>
+          <w:rFonts w:ascii="Cambria Math" w:hAnsi="Cambria Math" w:cs="Cambria Math"/>
+        </w:rPr>
+        <w:t>∧</w:t>
+      </w:r>
+      <w:r>
+        <w:t xml:space="preserve"> C(y)) </w:t>
+      </w:r>
+      <w:r>
+        <w:rPr>
+          <w:rFonts w:ascii="Cambria Math" w:hAnsi="Cambria Math" w:cs="Cambria Math"/>
+        </w:rPr>
+        <w:t>∧</w:t>
+      </w:r>
+      <w:r>
+        <w:t xml:space="preserve"> </w:t>
+      </w:r>
+      <w:r>
+        <w:rPr>
+          <w:rFonts w:ascii="Cambria Math" w:hAnsi="Cambria Math" w:cs="Cambria Math"/>
+        </w:rPr>
+        <w:t>∀</w:t>
+      </w:r>
+      <w:r>
+        <w:t>y(</w:t>
+      </w:r>
+      <w:r>
+        <w:t>¬</w:t>
+      </w:r>
+      <w:r>
+        <w:t>R(</w:t>
+      </w:r>
+      <w:r>
+        <w:t>s</w:t>
+      </w:r>
+      <w:r>
+        <w:t>, y)</w:t>
+      </w:r>
+      <w:r>
+        <w:rPr>
+          <w:rFonts w:ascii="Cambria Math" w:hAnsi="Cambria Math" w:cs="Cambria Math"/>
+          <w:kern w:val="0"/>
+          <w14:ligatures w14:val="none"/>
+        </w:rPr>
+        <w:t xml:space="preserve"> </w:t>
+      </w:r>
+      <w:r>
+        <w:rPr>
+          <w:rFonts w:ascii="Cambria Math" w:hAnsi="Cambria Math" w:cs="Cambria Math"/>
+        </w:rPr>
+        <w:t>∨</w:t>
+      </w:r>
+      <w:r>
+        <w:t xml:space="preserve"> H(y))</w:t>
+      </w:r>
+      <w:r>
+        <w:t xml:space="preserve"> (from 5 and </w:t>
+      </w:r>
+      <w:r>
+        <w:t>10</w:t>
+      </w:r>
+      <w:r>
+        <w:t>)</w:t>
+      </w:r>
+    </w:p>
+    <w:p>
+      <w:pPr>
+        <w:spacing w:line="240" w:lineRule="auto"/>
+        <w:jc w:val="center"/>
+      </w:pPr>
+      <w:r>
+        <w:t>|</w:t>
+      </w:r>
+    </w:p>
+    <w:p>
+      <w:pPr>
+        <w:spacing w:line="240" w:lineRule="auto"/>
+        <w:jc w:val="center"/>
+      </w:pPr>
+      <w:r>
+        <w:t>1</w:t>
+      </w:r>
+      <w:r>
+        <w:t>2</w:t>
+      </w:r>
+      <w:r>
+        <w:t xml:space="preserve">. </w:t>
+      </w:r>
+      <w:r>
+        <w:t>O(</w:t>
+      </w:r>
+      <w:r>
+        <w:t>s</w:t>
+      </w:r>
+      <w:r>
+        <w:t xml:space="preserve">, </w:t>
+      </w:r>
+      <w:r>
+        <w:t>a</w:t>
+      </w:r>
+      <w:r>
+        <w:t xml:space="preserve">) </w:t>
+      </w:r>
+      <w:r>
+        <w:rPr>
+          <w:rFonts w:ascii="Cambria Math" w:hAnsi="Cambria Math" w:cs="Cambria Math"/>
+        </w:rPr>
+        <w:t>∧</w:t>
+      </w:r>
+      <w:r>
+        <w:t xml:space="preserve"> C(</w:t>
+      </w:r>
+      <w:r>
+        <w:t>a</w:t>
+      </w:r>
+      <w:r>
+        <w:t>)</w:t>
+      </w:r>
+      <w:r>
+        <w:t xml:space="preserve"> (from 1</w:t>
+      </w:r>
+      <w:r>
+        <w:t>0</w:t>
+      </w:r>
+      <w:r>
+        <w:t>)</w:t>
+      </w:r>
+    </w:p>
+    <w:p>
+      <w:pPr>
+        <w:spacing w:line="240" w:lineRule="auto"/>
+        <w:jc w:val="center"/>
+      </w:pPr>
+      <w:r>
+        <w:t>|</w:t>
+      </w:r>
+    </w:p>
+    <w:p>
+      <w:pPr>
+        <w:spacing w:line="240" w:lineRule="auto"/>
+        <w:jc w:val="center"/>
+      </w:pPr>
+      <w:r>
+        <w:t>1</w:t>
+      </w:r>
+      <w:r>
+        <w:t>3</w:t>
+      </w:r>
+      <w:r>
+        <w:t xml:space="preserve">. </w:t>
+      </w:r>
+      <w:r>
+        <w:t>¬</w:t>
+      </w:r>
+      <w:r>
+        <w:t>R(</w:t>
+      </w:r>
+      <w:r>
+        <w:t>s</w:t>
+      </w:r>
+      <w:r>
+        <w:t xml:space="preserve">, </w:t>
+      </w:r>
+      <w:r>
+        <w:t>a</w:t>
+      </w:r>
+      <w:r>
+        <w:t>)</w:t>
+      </w:r>
+      <w:r>
+        <w:rPr>
+          <w:rFonts w:ascii="Cambria Math" w:hAnsi="Cambria Math" w:cs="Cambria Math"/>
+          <w:kern w:val="0"/>
+          <w14:ligatures w14:val="none"/>
+        </w:rPr>
+        <w:t xml:space="preserve"> </w:t>
+      </w:r>
+      <w:r>
+        <w:rPr>
+          <w:rFonts w:ascii="Cambria Math" w:hAnsi="Cambria Math" w:cs="Cambria Math"/>
+        </w:rPr>
+        <w:t>∨</w:t>
+      </w:r>
+      <w:r>
+        <w:t xml:space="preserve"> H(</w:t>
+      </w:r>
+      <w:r>
+        <w:t>a</w:t>
+      </w:r>
+      <w:r>
+        <w:t>)</w:t>
+      </w:r>
+      <w:r>
+        <w:t xml:space="preserve"> (from 1</w:t>
+      </w:r>
+      <w:r>
+        <w:t>0)</w:t>
+      </w:r>
+    </w:p>
+    <w:p>
+      <w:pPr>
+        <w:spacing w:line="240" w:lineRule="auto"/>
+        <w:jc w:val="center"/>
+      </w:pPr>
+      <w:r>
+        <w:t>|</w:t>
+      </w:r>
+    </w:p>
+    <w:p>
+      <w:pPr>
+        <w:spacing w:line="240" w:lineRule="auto"/>
+        <w:jc w:val="center"/>
+      </w:pPr>
+      <w:r>
+        <w:t>1</w:t>
+      </w:r>
+      <w:r>
+        <w:t>4</w:t>
+      </w:r>
+      <w:r>
+        <w:t>. O(s, a) (from 1</w:t>
+      </w:r>
+      <w:r>
+        <w:t>2</w:t>
+      </w:r>
+      <w:r>
+        <w:t>)</w:t>
+      </w:r>
+    </w:p>
+    <w:p>
+      <w:pPr>
+        <w:spacing w:line="240" w:lineRule="auto"/>
+        <w:jc w:val="center"/>
+      </w:pPr>
+      <w:r>
+        <w:t>|</w:t>
+      </w:r>
+    </w:p>
+    <w:p>
+      <w:pPr>
+        <w:spacing w:line="240" w:lineRule="auto"/>
+        <w:jc w:val="center"/>
+      </w:pPr>
+      <w:r>
+        <w:t>1</w:t>
+      </w:r>
+      <w:r>
+        <w:t>5</w:t>
+      </w:r>
+      <w:r>
+        <w:t>. C(a) (from 1</w:t>
+      </w:r>
+      <w:r>
+        <w:t>2</w:t>
+      </w:r>
+      <w:r>
+        <w:t>)</w:t>
+      </w:r>
+    </w:p>
+    <w:p>
+      <w:pPr>
+        <w:spacing w:line="240" w:lineRule="auto"/>
+        <w:jc w:val="center"/>
+      </w:pPr>
+      <w:r>
+        <w:t>|</w:t>
+      </w:r>
+    </w:p>
+    <w:p>
+      <w:pPr>
+        <w:spacing w:line="240" w:lineRule="auto"/>
+        <w:jc w:val="center"/>
+      </w:pPr>
+      <w:r>
+        <w:rPr>
+          <w:rFonts w:ascii="Cambria Math" w:hAnsi="Cambria Math" w:cs="Cambria Math"/>
+        </w:rPr>
+        <w:t>1</w:t>
+      </w:r>
+      <w:r>
+        <w:rPr>
+          <w:rFonts w:ascii="Cambria Math" w:hAnsi="Cambria Math" w:cs="Cambria Math"/>
+        </w:rPr>
+        <w:t>6</w:t>
+      </w:r>
+      <w:r>
+        <w:rPr>
+          <w:rFonts w:ascii="Cambria Math" w:hAnsi="Cambria Math" w:cs="Cambria Math"/>
+        </w:rPr>
+        <w:t>. ¬</w:t>
+      </w:r>
+      <w:r>
+        <w:t xml:space="preserve">O(s, </w:t>
+      </w:r>
+      <w:r>
+        <w:t>a</w:t>
+      </w:r>
+      <w:r>
+        <w:t>)</w:t>
+      </w:r>
+      <w:r>
+        <w:t xml:space="preserve"> </w:t>
+      </w:r>
+      <w:r>
+        <w:rPr>
+          <w:rFonts w:ascii="Cambria Math" w:hAnsi="Cambria Math" w:cs="Cambria Math"/>
+        </w:rPr>
+        <w:t>∨ ¬</w:t>
+      </w:r>
+      <w:r>
+        <w:t>A(</w:t>
+      </w:r>
+      <w:r>
+        <w:t>a)</w:t>
+      </w:r>
+      <w:r>
+        <w:t xml:space="preserve"> (from 6)</w:t>
+      </w:r>
+    </w:p>
+    <w:p>
+      <w:pPr>
+        <w:spacing w:line="240" w:lineRule="auto"/>
+        <w:jc w:val="center"/>
+      </w:pPr>
+      <w:r>
+        <w:t>/</w:t>
+      </w:r>
+      <w:r>
+        <w:tab/>
+        <w:t xml:space="preserve">     </w:t>
+      </w:r>
+      <w:r>
+        <w:t>\</w:t>
+      </w:r>
+    </w:p>
+    <w:p>
+      <w:pPr>
+        <w:spacing w:line="240" w:lineRule="auto"/>
+        <w:jc w:val="center"/>
+      </w:pPr>
+      <w:r>
+        <w:rPr>
+          <w:rFonts w:ascii="Cambria Math" w:hAnsi="Cambria Math" w:cs="Cambria Math"/>
+        </w:rPr>
+        <w:t>17</w:t>
+      </w:r>
+      <w:r>
+        <w:rPr>
+          <w:rFonts w:ascii="Cambria Math" w:hAnsi="Cambria Math" w:cs="Cambria Math"/>
+        </w:rPr>
+        <w:t xml:space="preserve">a. </w:t>
+      </w:r>
+      <w:r>
+        <w:rPr>
+          <w:rFonts w:ascii="Cambria Math" w:hAnsi="Cambria Math" w:cs="Cambria Math"/>
+        </w:rPr>
+        <w:t>¬</w:t>
+      </w:r>
+      <w:r>
+        <w:t xml:space="preserve">O(s, </w:t>
+      </w:r>
+      <w:r>
+        <w:t>a)</w:t>
+      </w:r>
+      <w:r>
+        <w:tab/>
+      </w:r>
+      <w:r>
+        <w:tab/>
+        <w:t>1</w:t>
+      </w:r>
+      <w:r>
+        <w:t>7</w:t>
+      </w:r>
+      <w:r>
+        <w:t xml:space="preserve">b. </w:t>
+      </w:r>
+      <w:r>
+        <w:rPr>
+          <w:rFonts w:ascii="Cambria Math" w:hAnsi="Cambria Math" w:cs="Cambria Math"/>
+        </w:rPr>
+        <w:t>¬</w:t>
+      </w:r>
+      <w:r>
+        <w:t>A(</w:t>
+      </w:r>
+      <w:r>
+        <w:t>a)</w:t>
+      </w:r>
+    </w:p>
+    <w:p>
+      <w:pPr>
+        <w:spacing w:line="240" w:lineRule="auto"/>
+        <w:jc w:val="center"/>
+      </w:pPr>
+      <w:r>
+        <w:t>|</w:t>
+      </w:r>
+      <w:r>
+        <w:tab/>
+      </w:r>
+      <w:r>
+        <w:tab/>
+        <w:t xml:space="preserve">          |</w:t>
+      </w:r>
+    </w:p>
+    <w:p>
+      <w:pPr>
+        <w:spacing w:line="240" w:lineRule="auto"/>
+        <w:ind w:left="720" w:firstLine="720"/>
+        <w:jc w:val="center"/>
+      </w:pPr>
+      <w:r>
+        <w:t>CLOSED (by 1</w:t>
+      </w:r>
+      <w:r>
+        <w:t>4</w:t>
+      </w:r>
+      <w:r>
+        <w:t>)</w:t>
+      </w:r>
+      <w:r>
+        <w:tab/>
+      </w:r>
+      <w:r>
+        <w:t>18</w:t>
+      </w:r>
+      <w:r>
+        <w:t xml:space="preserve">. </w:t>
+      </w:r>
+      <w:r>
+        <w:t>A(</w:t>
+      </w:r>
+      <w:r>
+        <w:t>a</w:t>
+      </w:r>
+      <w:r>
+        <w:t xml:space="preserve">) </w:t>
+      </w:r>
+      <w:r>
+        <w:rPr>
+          <w:rFonts w:ascii="Cambria Math" w:hAnsi="Cambria Math" w:cs="Cambria Math"/>
+        </w:rPr>
+        <w:t>∨</w:t>
+      </w:r>
+      <w:r>
+        <w:t xml:space="preserve"> D(</w:t>
+      </w:r>
+      <w:r>
+        <w:t>a</w:t>
+      </w:r>
+      <w:r>
+        <w:t>)</w:t>
+      </w:r>
+      <w:r>
+        <w:t xml:space="preserve"> (from </w:t>
+      </w:r>
+      <w:r>
+        <w:t>8</w:t>
+      </w:r>
+      <w:r>
+        <w:t>)</w:t>
+      </w:r>
+      <w:r>
+        <w:tab/>
+      </w:r>
+    </w:p>
+    <w:p>
+      <w:pPr>
+        <w:spacing w:line="240" w:lineRule="auto"/>
+        <w:jc w:val="center"/>
+      </w:pPr>
+      <w:r>
+        <w:tab/>
+      </w:r>
+      <w:r>
+        <w:tab/>
+      </w:r>
+      <w:r>
+        <w:tab/>
+        <w:t xml:space="preserve">      /             \</w:t>
+      </w:r>
+    </w:p>
+    <w:p>
+      <w:pPr>
+        <w:spacing w:line="240" w:lineRule="auto"/>
+        <w:jc w:val="center"/>
+      </w:pPr>
+      <w:r>
+        <w:tab/>
+      </w:r>
+      <w:r>
+        <w:tab/>
+      </w:r>
+      <w:r>
+        <w:tab/>
+      </w:r>
+      <w:r>
+        <w:tab/>
+        <w:t>19</w:t>
+      </w:r>
+      <w:r>
+        <w:t>a. A(a)</w:t>
+      </w:r>
+      <w:r>
+        <w:tab/>
+        <w:t>19b. D(a)</w:t>
+      </w:r>
+    </w:p>
+    <w:p>
+      <w:pPr>
+        <w:spacing w:line="240" w:lineRule="auto"/>
+        <w:jc w:val="center"/>
+      </w:pPr>
+      <w:r>
+        <w:tab/>
+      </w:r>
+      <w:r>
+        <w:tab/>
+      </w:r>
+      <w:r>
+        <w:tab/>
+      </w:r>
+      <w:r>
+        <w:tab/>
+        <w:t>|                     |</w:t>
+      </w:r>
+    </w:p>
+    <w:p>
+      <w:pPr>
+        <w:spacing w:line="240" w:lineRule="auto"/>
+        <w:ind w:left="2880" w:firstLine="720"/>
+        <w:jc w:val="center"/>
+      </w:pPr>
+      <w:r>
+        <w:t>CLOSED (by 17b)</w:t>
+      </w:r>
+      <w:r>
+        <w:tab/>
+        <w:t xml:space="preserve">20. </w:t>
+      </w:r>
+      <w:r>
+        <w:t>¬H(</w:t>
+      </w:r>
+      <w:r>
+        <w:t>a</w:t>
+      </w:r>
+      <w:r>
+        <w:t xml:space="preserve">) </w:t>
+      </w:r>
+      <w:r>
+        <w:rPr>
+          <w:rFonts w:ascii="Cambria Math" w:hAnsi="Cambria Math" w:cs="Cambria Math"/>
+        </w:rPr>
+        <w:t>∨</w:t>
+      </w:r>
+      <w:r>
+        <w:t xml:space="preserve"> </w:t>
+      </w:r>
+      <w:r>
+        <w:t>¬D(</w:t>
+      </w:r>
+      <w:r>
+        <w:t>a</w:t>
+      </w:r>
+      <w:r>
+        <w:t>)</w:t>
+      </w:r>
+      <w:r>
+        <w:t xml:space="preserve"> (repeat of 7)</w:t>
+      </w:r>
+    </w:p>
+    <w:p>
+      <w:pPr>
+        <w:spacing w:line="240" w:lineRule="auto"/>
+        <w:ind w:left="4320" w:firstLine="720"/>
+        <w:jc w:val="center"/>
+      </w:pPr>
+      <w:r>
+        <w:t xml:space="preserve">/ </w:t>
+      </w:r>
+      <w:r>
+        <w:tab/>
+        <w:t xml:space="preserve">  \</w:t>
+      </w:r>
+    </w:p>
+    <w:p>
+      <w:pPr>
+        <w:spacing w:line="240" w:lineRule="auto"/>
+        <w:ind w:left="4320" w:firstLine="720"/>
+        <w:jc w:val="center"/>
+      </w:pPr>
+      <w:r>
+        <w:t xml:space="preserve">    21a. </w:t>
+      </w:r>
+      <w:r>
+        <w:t>¬H(</w:t>
+      </w:r>
+      <w:r>
+        <w:t xml:space="preserve">a)        21b. </w:t>
+      </w:r>
+      <w:r>
+        <w:t>¬D(</w:t>
+      </w:r>
+      <w:r>
+        <w:t>a</w:t>
+      </w:r>
+      <w:r>
+        <w:t>)</w:t>
+      </w:r>
+    </w:p>
+    <w:p>
+      <w:pPr>
+        <w:spacing w:line="240" w:lineRule="auto"/>
+        <w:ind w:left="4320" w:firstLine="720"/>
+        <w:jc w:val="center"/>
+      </w:pPr>
+      <w:r>
+        <w:t xml:space="preserve"> |</w:t>
+      </w:r>
+      <w:r>
+        <w:tab/>
+      </w:r>
+      <w:r>
+        <w:tab/>
+        <w:t>|</w:t>
+      </w:r>
+    </w:p>
+    <w:p>
+      <w:pPr>
+        <w:spacing w:line="240" w:lineRule="auto"/>
+        <w:ind w:left="3600" w:firstLine="720"/>
+      </w:pPr>
+      <w:r>
+        <w:t>22</w:t>
+      </w:r>
+      <w:r>
+        <w:t xml:space="preserve">. </w:t>
+      </w:r>
+      <w:bookmarkStart w:id="0" w:name="_Hlk214220245"/>
+      <w:r>
+        <w:t>¬</w:t>
+      </w:r>
+      <w:bookmarkEnd w:id="0"/>
+      <w:r>
+        <w:t>R(</w:t>
+      </w:r>
+      <w:r>
+        <w:t>s</w:t>
+      </w:r>
+      <w:r>
+        <w:t xml:space="preserve">, </w:t>
+      </w:r>
+      <w:r>
+        <w:t>a</w:t>
+      </w:r>
+      <w:r>
+        <w:t>)</w:t>
+      </w:r>
+      <w:r>
+        <w:rPr>
+          <w:rFonts w:ascii="Cambria Math" w:hAnsi="Cambria Math" w:cs="Cambria Math"/>
+          <w:kern w:val="0"/>
+          <w14:ligatures w14:val="none"/>
+        </w:rPr>
+        <w:t xml:space="preserve"> </w:t>
+      </w:r>
+      <w:r>
+        <w:rPr>
+          <w:rFonts w:ascii="Cambria Math" w:hAnsi="Cambria Math" w:cs="Cambria Math"/>
+        </w:rPr>
+        <w:t>∨</w:t>
+      </w:r>
+      <w:r>
+        <w:t xml:space="preserve"> H(</w:t>
+      </w:r>
+      <w:r>
+        <w:t>a</w:t>
+      </w:r>
+      <w:r>
+        <w:t>)</w:t>
+      </w:r>
+      <w:r>
+        <w:t xml:space="preserve"> (from 1</w:t>
+      </w:r>
+      <w:r>
+        <w:t>3</w:t>
+      </w:r>
+      <w:r>
+        <w:t>)</w:t>
+      </w:r>
+      <w:r>
+        <w:tab/>
+      </w:r>
+      <w:r>
+        <w:t xml:space="preserve">   </w:t>
+      </w:r>
+      <w:r>
+        <w:t xml:space="preserve">  CLOSED (by 19b)</w:t>
+      </w:r>
+    </w:p>
+    <w:p>
+      <w:pPr>
+        <w:spacing w:line="240" w:lineRule="auto"/>
+      </w:pPr>
+      <w:r>
+        <w:tab/>
+      </w:r>
+      <w:r>
+        <w:tab/>
+      </w:r>
+      <w:r>
+        <w:tab/>
+      </w:r>
+      <w:r>
+        <w:tab/>
+      </w:r>
+      <w:r>
+        <w:tab/>
+      </w:r>
+      <w:r>
+        <w:tab/>
+      </w:r>
+      <w:r>
+        <w:tab/>
+      </w:r>
+      <w:r>
+        <w:t xml:space="preserve">/ </w:t>
+      </w:r>
+      <w:r>
+        <w:tab/>
+        <w:t xml:space="preserve">  \</w:t>
+      </w:r>
+    </w:p>
+    <w:p>
+      <w:pPr>
+        <w:spacing w:line="240" w:lineRule="auto"/>
+        <w:ind w:left="3600" w:firstLine="720"/>
+      </w:pPr>
+      <w:r>
+        <w:t xml:space="preserve">23a. </w:t>
+      </w:r>
+      <w:r>
+        <w:t>¬</w:t>
+      </w:r>
+      <w:r>
+        <w:t>R(s, a)    23b. H(a)</w:t>
+      </w:r>
+    </w:p>
+    <w:p>
+      <w:pPr>
+        <w:spacing w:line="240" w:lineRule="auto"/>
+        <w:ind w:left="3600" w:firstLine="720"/>
+      </w:pPr>
+      <w:r>
+        <w:t xml:space="preserve">        |</w:t>
+      </w:r>
+      <w:r>
+        <w:tab/>
+      </w:r>
+      <w:r>
+        <w:tab/>
+        <w:t xml:space="preserve">     |</w:t>
+      </w:r>
+    </w:p>
+    <w:p>
+      <w:pPr>
+        <w:spacing w:line="240" w:lineRule="auto"/>
+        <w:ind w:left="2160"/>
+      </w:pPr>
+      <w:r>
+        <w:t xml:space="preserve">         24. </w:t>
+      </w:r>
+      <w:r>
+        <w:t>¬O(</w:t>
+      </w:r>
+      <w:r>
+        <w:t>s</w:t>
+      </w:r>
+      <w:r>
+        <w:t>,</w:t>
+      </w:r>
+      <w:r>
+        <w:t xml:space="preserve"> a</w:t>
+      </w:r>
+      <w:r>
+        <w:t xml:space="preserve">) </w:t>
+      </w:r>
+      <w:r>
+        <w:rPr>
+          <w:rFonts w:ascii="Cambria Math" w:hAnsi="Cambria Math" w:cs="Cambria Math"/>
+        </w:rPr>
+        <w:t>∨</w:t>
+      </w:r>
+      <w:r>
+        <w:t xml:space="preserve"> R(</w:t>
+      </w:r>
+      <w:r>
+        <w:t>s</w:t>
+      </w:r>
+      <w:r>
+        <w:t xml:space="preserve">, </w:t>
+      </w:r>
+      <w:r>
+        <w:t>a</w:t>
+      </w:r>
+      <w:r>
+        <w:t>)</w:t>
+      </w:r>
+      <w:r>
+        <w:t xml:space="preserve"> (from 9)    CLOSED (by 21a)</w:t>
+      </w:r>
+    </w:p>
+    <w:p>
+      <w:pPr>
+        <w:spacing w:line="240" w:lineRule="auto"/>
+        <w:ind w:left="2160"/>
+      </w:pPr>
+      <w:r>
+        <w:tab/>
+      </w:r>
+      <w:r>
+        <w:tab/>
+      </w:r>
+      <w:r>
+        <w:t xml:space="preserve">/ </w:t>
+      </w:r>
+      <w:r>
+        <w:tab/>
+        <w:t xml:space="preserve">  \</w:t>
+      </w:r>
+    </w:p>
+    <w:p>
+      <w:pPr>
+        <w:spacing w:line="240" w:lineRule="auto"/>
+        <w:ind w:left="2160"/>
+      </w:pPr>
+      <w:r>
+        <w:t>CLOSED (by 17a)      25. R(s, a)</w:t>
+      </w:r>
+    </w:p>
+    <w:p>
+      <w:pPr>
+        <w:spacing w:line="240" w:lineRule="auto"/>
+        <w:ind w:left="2160"/>
+      </w:pPr>
+      <w:r>
+        <w:tab/>
+      </w:r>
+      <w:r>
+        <w:tab/>
+      </w:r>
+      <w:r>
+        <w:tab/>
+        <w:t xml:space="preserve">     |</w:t>
+      </w:r>
+    </w:p>
+    <w:p>
+      <w:pPr>
+        <w:spacing w:line="240" w:lineRule="auto"/>
+        <w:ind w:left="2160"/>
+      </w:pPr>
+      <w:r>
+        <w:tab/>
+      </w:r>
+      <w:r>
+        <w:tab/>
+        <w:t xml:space="preserve">     CLOSED </w:t>
+      </w:r>
+      <w:r>
+        <w:t>(</w:t>
+      </w:r>
+      <w:r>
+        <w:t>by</w:t>
+      </w:r>
+      <w:r>
+        <w:t xml:space="preserve"> 23a)</w:t>
+      </w:r>
+    </w:p>
+    <w:p>
+      <w:pPr>
+        <w:spacing w:line="240" w:lineRule="auto"/>
+      </w:pPr>
+    </w:p>
+    <w:p>
+      <w:pPr>
+        <w:spacing w:line="240" w:lineRule="auto"/>
+        <w:rPr>
+          <w:b/>
+          <w:bCs/>
+        </w:rPr>
+      </w:pPr>
+    </w:p>
+    <w:p>
+      <w:pPr>
+        <w:spacing w:line="240" w:lineRule="auto"/>
+        <w:rPr>
+          <w:b/>
+          <w:bCs/>
+        </w:rPr>
+      </w:pPr>
+    </w:p>
+    <w:p>
+      <w:pPr>
+        <w:spacing w:line="240" w:lineRule="auto"/>
+        <w:rPr>
+          <w:b/>
+          <w:bCs/>
+        </w:rPr>
+      </w:pPr>
+    </w:p>
+    <w:p>
+      <w:pPr>
+        <w:spacing w:line="240" w:lineRule="auto"/>
+        <w:rPr>
+          <w:b/>
+          <w:bCs/>
+        </w:rPr>
+      </w:pPr>
+    </w:p>
+    <w:p>
+      <w:pPr>
+        <w:spacing w:line="240" w:lineRule="auto"/>
+        <w:rPr>
+          <w:b/>
+          <w:bCs/>
+        </w:rPr>
+      </w:pPr>
+    </w:p>
+    <w:p>
+      <w:pPr>
+        <w:spacing w:line="240" w:lineRule="auto"/>
+        <w:rPr>
+          <w:b/>
+          <w:bCs/>
+        </w:rPr>
+      </w:pPr>
+    </w:p>
+    <w:p>
+      <w:pPr>
+        <w:rPr>
+          <w:b/>
+          <w:bCs/>
+        </w:rPr>
+      </w:pPr>
+      <w:r>
+        <w:rPr>
+          <w:b/>
+          <w:bCs/>
+        </w:rPr>
+        <w:lastRenderedPageBreak/>
+        <w:t>Exercise 62</w:t>
+      </w:r>
+    </w:p>
+    <w:p>
+      <w:r>
+        <w:t>Q(a)</w:t>
+      </w:r>
+      <w:r>
+        <w:rPr>
+          <w:rFonts w:ascii="Cambria Math" w:hAnsi="Cambria Math" w:cs="Cambria Math"/>
+        </w:rPr>
+        <w:t>∧</w:t>
+      </w:r>
+      <w:r>
+        <w:t>Q(b)</w:t>
+      </w:r>
+      <w:r>
+        <w:rPr>
+          <w:rFonts w:ascii="Cambria Math" w:hAnsi="Cambria Math" w:cs="Cambria Math"/>
+        </w:rPr>
+        <w:t>∧∀</w:t>
+      </w:r>
+      <w:r>
+        <w:t>x(P(x)</w:t>
+      </w:r>
+      <w:r>
+        <w:rPr>
+          <w:rFonts w:ascii="Cambria Math" w:hAnsi="Cambria Math" w:cs="Cambria Math"/>
+        </w:rPr>
+        <w:t>∧</w:t>
+      </w:r>
+      <w:r>
+        <w:t>(Q(x) → ¬P(x)))</w:t>
+      </w:r>
+      <w:r>
+        <w:t xml:space="preserve"> = </w:t>
+      </w:r>
+      <w:r>
+        <w:t>Q(a)</w:t>
+      </w:r>
+      <w:r>
+        <w:rPr>
+          <w:rFonts w:ascii="Cambria Math" w:hAnsi="Cambria Math" w:cs="Cambria Math"/>
+        </w:rPr>
+        <w:t>∧</w:t>
+      </w:r>
+      <w:r>
+        <w:t>Q(b)</w:t>
+      </w:r>
+      <w:r>
+        <w:rPr>
+          <w:rFonts w:ascii="Cambria Math" w:hAnsi="Cambria Math" w:cs="Cambria Math"/>
+        </w:rPr>
+        <w:t>∧∀</w:t>
+      </w:r>
+      <w:r>
+        <w:t>x(P(x)</w:t>
+      </w:r>
+      <w:r>
+        <w:rPr>
+          <w:rFonts w:ascii="Cambria Math" w:hAnsi="Cambria Math" w:cs="Cambria Math"/>
+        </w:rPr>
+        <w:t>∧</w:t>
+      </w:r>
+      <w:r>
+        <w:t xml:space="preserve">(¬Q(x) </w:t>
+      </w:r>
+      <w:r>
+        <w:rPr>
+          <w:rFonts w:ascii="Cambria Math" w:hAnsi="Cambria Math" w:cs="Cambria Math"/>
+        </w:rPr>
+        <w:t>∨</w:t>
+      </w:r>
+      <w:r>
+        <w:t xml:space="preserve"> </w:t>
+      </w:r>
+      <w:r>
+        <w:t>¬P(x)))</w:t>
+      </w:r>
+    </w:p>
+    <w:p>
+      <w:pPr>
+        <w:spacing w:line="240" w:lineRule="auto"/>
+        <w:jc w:val="center"/>
+      </w:pPr>
+      <w:r>
+        <w:t>Q(a)</w:t>
+      </w:r>
+      <w:r>
+        <w:rPr>
+          <w:rFonts w:ascii="Cambria Math" w:hAnsi="Cambria Math" w:cs="Cambria Math"/>
+        </w:rPr>
+        <w:t>∧</w:t>
+      </w:r>
+      <w:r>
+        <w:t>Q(b)</w:t>
+      </w:r>
+      <w:r>
+        <w:rPr>
+          <w:rFonts w:ascii="Cambria Math" w:hAnsi="Cambria Math" w:cs="Cambria Math"/>
+        </w:rPr>
+        <w:t>∧∀</w:t>
+      </w:r>
+      <w:r>
+        <w:t>x(P(x)</w:t>
+      </w:r>
+      <w:r>
+        <w:rPr>
+          <w:rFonts w:ascii="Cambria Math" w:hAnsi="Cambria Math" w:cs="Cambria Math"/>
+        </w:rPr>
+        <w:t>∧</w:t>
+      </w:r>
+      <w:r>
+        <w:t xml:space="preserve">(¬Q(x) </w:t>
+      </w:r>
+      <w:r>
+        <w:rPr>
+          <w:rFonts w:ascii="Cambria Math" w:hAnsi="Cambria Math" w:cs="Cambria Math"/>
+        </w:rPr>
+        <w:t>∨</w:t>
+      </w:r>
+      <w:r>
+        <w:t xml:space="preserve"> </w:t>
+      </w:r>
+      <w:r>
+        <w:t>¬P(x)))</w:t>
+      </w:r>
+    </w:p>
+    <w:p>
+      <w:pPr>
+        <w:spacing w:line="240" w:lineRule="auto"/>
+        <w:jc w:val="center"/>
+      </w:pPr>
+      <w:r>
+        <w:t>|</w:t>
+      </w:r>
+    </w:p>
+    <w:p>
+      <w:pPr>
+        <w:spacing w:line="240" w:lineRule="auto"/>
+        <w:jc w:val="center"/>
+      </w:pPr>
+      <w:r>
+        <w:t>1. Q(a)</w:t>
+      </w:r>
+    </w:p>
+    <w:p>
+      <w:pPr>
+        <w:spacing w:line="240" w:lineRule="auto"/>
+        <w:jc w:val="center"/>
+      </w:pPr>
+      <w:r>
+        <w:t>|</w:t>
+      </w:r>
+    </w:p>
+    <w:p>
+      <w:pPr>
+        <w:spacing w:line="240" w:lineRule="auto"/>
+        <w:jc w:val="center"/>
+      </w:pPr>
+      <w:r>
+        <w:t>2. Q(b)</w:t>
+      </w:r>
+      <w:r>
+        <w:br/>
+        <w:t>|</w:t>
+      </w:r>
+    </w:p>
+    <w:p>
+      <w:pPr>
+        <w:spacing w:line="240" w:lineRule="auto"/>
+        <w:jc w:val="center"/>
+      </w:pPr>
+      <w:r>
+        <w:t xml:space="preserve">3. </w:t>
+      </w:r>
+      <w:r>
+        <w:rPr>
+          <w:rFonts w:ascii="Cambria Math" w:hAnsi="Cambria Math" w:cs="Cambria Math"/>
+        </w:rPr>
+        <w:t>∀</w:t>
+      </w:r>
+      <w:r>
+        <w:t>x(P(x)</w:t>
+      </w:r>
+      <w:r>
+        <w:rPr>
+          <w:rFonts w:ascii="Cambria Math" w:hAnsi="Cambria Math" w:cs="Cambria Math"/>
+        </w:rPr>
+        <w:t>∧</w:t>
+      </w:r>
+      <w:r>
+        <w:t xml:space="preserve">(¬Q(x) </w:t>
+      </w:r>
+      <w:r>
+        <w:rPr>
+          <w:rFonts w:ascii="Cambria Math" w:hAnsi="Cambria Math" w:cs="Cambria Math"/>
+        </w:rPr>
+        <w:t>∨</w:t>
+      </w:r>
+      <w:r>
+        <w:t xml:space="preserve"> </w:t>
+      </w:r>
+      <w:r>
+        <w:t>¬P(x))</w:t>
+      </w:r>
+      <w:r>
+        <w:t>)</w:t>
+      </w:r>
+    </w:p>
+    <w:p>
+      <w:pPr>
+        <w:spacing w:line="240" w:lineRule="auto"/>
+        <w:jc w:val="center"/>
+      </w:pPr>
+      <w:r>
+        <w:t>|</w:t>
+      </w:r>
+    </w:p>
+    <w:p>
+      <w:pPr>
+        <w:spacing w:line="240" w:lineRule="auto"/>
+        <w:jc w:val="center"/>
+      </w:pPr>
+      <w:r>
+        <w:t xml:space="preserve">4. </w:t>
+      </w:r>
+      <w:r>
+        <w:t>P(</w:t>
+      </w:r>
+      <w:r>
+        <w:t>a</w:t>
+      </w:r>
+      <w:r>
+        <w:t>)</w:t>
+      </w:r>
+      <w:r>
+        <w:rPr>
+          <w:rFonts w:ascii="Cambria Math" w:hAnsi="Cambria Math" w:cs="Cambria Math"/>
+        </w:rPr>
+        <w:t>∧</w:t>
+      </w:r>
+      <w:r>
+        <w:t>(¬Q(</w:t>
+      </w:r>
+      <w:r>
+        <w:t>a</w:t>
+      </w:r>
+      <w:r>
+        <w:t xml:space="preserve">) </w:t>
+      </w:r>
+      <w:r>
+        <w:rPr>
+          <w:rFonts w:ascii="Cambria Math" w:hAnsi="Cambria Math" w:cs="Cambria Math"/>
+        </w:rPr>
+        <w:t>∨</w:t>
+      </w:r>
+      <w:r>
+        <w:t xml:space="preserve"> </w:t>
+      </w:r>
+      <w:r>
+        <w:t>¬P(</w:t>
+      </w:r>
+      <w:r>
+        <w:t>a</w:t>
+      </w:r>
+      <w:r>
+        <w:t>))</w:t>
+      </w:r>
+      <w:r>
+        <w:t xml:space="preserve"> (from 3)</w:t>
+      </w:r>
+    </w:p>
+    <w:p>
+      <w:pPr>
+        <w:spacing w:line="240" w:lineRule="auto"/>
+        <w:jc w:val="center"/>
+      </w:pPr>
+      <w:r>
+        <w:t>|</w:t>
+      </w:r>
+    </w:p>
+    <w:p>
+      <w:pPr>
+        <w:spacing w:line="240" w:lineRule="auto"/>
+        <w:jc w:val="center"/>
+      </w:pPr>
+      <w:r>
+        <w:t>5</w:t>
+      </w:r>
+      <w:r>
+        <w:t xml:space="preserve">. </w:t>
+      </w:r>
+      <w:r>
+        <w:t>P(</w:t>
+      </w:r>
+      <w:r>
+        <w:t>b</w:t>
+      </w:r>
+      <w:r>
+        <w:t>)</w:t>
+      </w:r>
+      <w:r>
+        <w:rPr>
+          <w:rFonts w:ascii="Cambria Math" w:hAnsi="Cambria Math" w:cs="Cambria Math"/>
+        </w:rPr>
+        <w:t>∧</w:t>
+      </w:r>
+      <w:r>
+        <w:t>(¬Q(</w:t>
+      </w:r>
+      <w:r>
+        <w:t>b</w:t>
+      </w:r>
+      <w:r>
+        <w:t xml:space="preserve">) </w:t>
+      </w:r>
+      <w:r>
+        <w:rPr>
+          <w:rFonts w:ascii="Cambria Math" w:hAnsi="Cambria Math" w:cs="Cambria Math"/>
+        </w:rPr>
+        <w:t>∨</w:t>
+      </w:r>
+      <w:r>
+        <w:t xml:space="preserve"> </w:t>
+      </w:r>
+      <w:r>
+        <w:t>¬P(</w:t>
+      </w:r>
+      <w:r>
+        <w:t>b</w:t>
+      </w:r>
+      <w:r>
+        <w:t>))</w:t>
+      </w:r>
+      <w:r>
+        <w:t xml:space="preserve"> (from 3)</w:t>
+      </w:r>
+    </w:p>
+    <w:p>
+      <w:pPr>
+        <w:spacing w:line="240" w:lineRule="auto"/>
+        <w:jc w:val="center"/>
+      </w:pPr>
+      <w:r>
+        <w:t>|</w:t>
+      </w:r>
+    </w:p>
+    <w:p>
+      <w:pPr>
+        <w:spacing w:line="240" w:lineRule="auto"/>
+        <w:jc w:val="center"/>
+      </w:pPr>
+      <w:r>
+        <w:t>6. P(a) (from 4)</w:t>
+      </w:r>
+    </w:p>
+    <w:p>
+      <w:pPr>
+        <w:spacing w:line="240" w:lineRule="auto"/>
+        <w:jc w:val="center"/>
+      </w:pPr>
+      <w:r>
+        <w:t>|</w:t>
+      </w:r>
+    </w:p>
+    <w:p>
+      <w:pPr>
+        <w:spacing w:line="240" w:lineRule="auto"/>
+        <w:jc w:val="center"/>
+      </w:pPr>
+      <w:r>
+        <w:t>7</w:t>
+      </w:r>
+      <w:r>
+        <w:t>. P(</w:t>
+      </w:r>
+      <w:r>
+        <w:t>b</w:t>
+      </w:r>
+      <w:r>
+        <w:t xml:space="preserve">) (from </w:t>
+      </w:r>
+      <w:r>
+        <w:t>5</w:t>
+      </w:r>
+      <w:r>
+        <w:t>)</w:t>
+      </w:r>
+    </w:p>
+    <w:p>
+      <w:pPr>
+        <w:spacing w:line="240" w:lineRule="auto"/>
+        <w:jc w:val="center"/>
+      </w:pPr>
+      <w:r>
+        <w:t>|</w:t>
+      </w:r>
+    </w:p>
+    <w:p>
+      <w:pPr>
+        <w:spacing w:line="240" w:lineRule="auto"/>
+        <w:ind w:firstLine="720"/>
+        <w:jc w:val="center"/>
+      </w:pPr>
+      <w:r>
+        <w:t xml:space="preserve">8. </w:t>
+      </w:r>
+      <w:r>
+        <w:t>¬Q(</w:t>
+      </w:r>
+      <w:r>
+        <w:t>a</w:t>
+      </w:r>
+      <w:r>
+        <w:t xml:space="preserve">) </w:t>
+      </w:r>
+      <w:r>
+        <w:rPr>
+          <w:rFonts w:ascii="Cambria Math" w:hAnsi="Cambria Math" w:cs="Cambria Math"/>
+        </w:rPr>
+        <w:t>∨</w:t>
+      </w:r>
+      <w:r>
+        <w:t xml:space="preserve"> </w:t>
+      </w:r>
+      <w:r>
+        <w:t>¬P(</w:t>
+      </w:r>
+      <w:r>
+        <w:t>a</w:t>
+      </w:r>
+      <w:r>
+        <w:t>)</w:t>
+      </w:r>
+      <w:r>
+        <w:t xml:space="preserve"> (from 4)</w:t>
+      </w:r>
+    </w:p>
+    <w:p>
+      <w:pPr>
+        <w:spacing w:line="240" w:lineRule="auto"/>
+        <w:ind w:firstLine="720"/>
+        <w:jc w:val="center"/>
+      </w:pPr>
+      <w:r>
+        <w:t xml:space="preserve">/   </w:t>
+      </w:r>
+      <w:r>
+        <w:tab/>
+        <w:t>\</w:t>
+      </w:r>
+      <w:r>
+        <w:tab/>
+      </w:r>
+    </w:p>
+    <w:p>
+      <w:pPr>
+        <w:spacing w:line="240" w:lineRule="auto"/>
+        <w:ind w:firstLine="720"/>
+        <w:jc w:val="center"/>
+      </w:pPr>
+      <w:r>
+        <w:t xml:space="preserve">9a. </w:t>
+      </w:r>
+      <w:r>
+        <w:t>¬Q(</w:t>
+      </w:r>
+      <w:r>
+        <w:t>a</w:t>
+      </w:r>
+      <w:r>
+        <w:t>)</w:t>
+      </w:r>
+      <w:r>
+        <w:t xml:space="preserve">     9b. </w:t>
+      </w:r>
+      <w:r>
+        <w:t>¬P(</w:t>
+      </w:r>
+      <w:r>
+        <w:t>a</w:t>
+      </w:r>
+      <w:r>
+        <w:t>)</w:t>
+      </w:r>
+      <w:r>
+        <w:tab/>
+      </w:r>
+      <w:r>
+        <w:tab/>
+      </w:r>
+    </w:p>
+    <w:p>
+      <w:pPr>
+        <w:spacing w:line="240" w:lineRule="auto"/>
+        <w:jc w:val="center"/>
+      </w:pPr>
+      <w:r>
+        <w:t>|</w:t>
+      </w:r>
+      <w:r>
+        <w:tab/>
+      </w:r>
+      <w:r>
+        <w:tab/>
+        <w:t>|</w:t>
+      </w:r>
+    </w:p>
+    <w:p>
+      <w:pPr>
+        <w:spacing w:line="240" w:lineRule="auto"/>
+        <w:jc w:val="center"/>
+      </w:pPr>
+      <w:r>
+        <w:t xml:space="preserve">              10</w:t>
+      </w:r>
+      <w:r>
+        <w:t xml:space="preserve">. </w:t>
+      </w:r>
+      <w:r>
+        <w:t>¬Q(</w:t>
+      </w:r>
+      <w:r>
+        <w:t>b</w:t>
+      </w:r>
+      <w:r>
+        <w:t xml:space="preserve">) </w:t>
+      </w:r>
+      <w:r>
+        <w:rPr>
+          <w:rFonts w:ascii="Cambria Math" w:hAnsi="Cambria Math" w:cs="Cambria Math"/>
+        </w:rPr>
+        <w:t>∨</w:t>
+      </w:r>
+      <w:r>
+        <w:t xml:space="preserve"> </w:t>
+      </w:r>
+      <w:r>
+        <w:t>¬P(</w:t>
+      </w:r>
+      <w:r>
+        <w:t>b</w:t>
+      </w:r>
+      <w:r>
+        <w:t>)</w:t>
+      </w:r>
+      <w:r>
+        <w:t xml:space="preserve"> (from </w:t>
+      </w:r>
+      <w:r>
+        <w:t>5</w:t>
+      </w:r>
+      <w:r>
+        <w:t>)</w:t>
+      </w:r>
+      <w:r>
+        <w:tab/>
+        <w:t xml:space="preserve">       CLOSED (by 6)</w:t>
+      </w:r>
+      <w:r>
+        <w:tab/>
+      </w:r>
+      <w:r>
+        <w:tab/>
+      </w:r>
+      <w:r>
+        <w:tab/>
+      </w:r>
+    </w:p>
+    <w:p>
+      <w:pPr>
+        <w:spacing w:line="240" w:lineRule="auto"/>
+        <w:jc w:val="center"/>
+      </w:pPr>
+      <w:r>
+        <w:t>/             \</w:t>
+      </w:r>
+      <w:r>
+        <w:tab/>
+      </w:r>
+      <w:r>
+        <w:tab/>
+      </w:r>
+      <w:r>
+        <w:tab/>
+      </w:r>
+      <w:r>
+        <w:tab/>
+      </w:r>
+      <w:r>
+        <w:tab/>
+      </w:r>
+    </w:p>
+    <w:p>
+      <w:pPr>
+        <w:spacing w:line="240" w:lineRule="auto"/>
+        <w:ind w:firstLine="720"/>
+        <w:jc w:val="center"/>
+      </w:pPr>
+      <w:r>
+        <w:t xml:space="preserve">     11</w:t>
+      </w:r>
+      <w:r>
+        <w:t xml:space="preserve">a. </w:t>
+      </w:r>
+      <w:r>
+        <w:t>¬Q(</w:t>
+      </w:r>
+      <w:r>
+        <w:t>b</w:t>
+      </w:r>
+      <w:r>
+        <w:t>)</w:t>
+      </w:r>
+      <w:r>
+        <w:t xml:space="preserve">     </w:t>
+      </w:r>
+      <w:r>
+        <w:t>11</w:t>
+      </w:r>
+      <w:r>
+        <w:t xml:space="preserve">b. </w:t>
+      </w:r>
+      <w:r>
+        <w:t>¬P(</w:t>
+      </w:r>
+      <w:r>
+        <w:t>b</w:t>
+      </w:r>
+      <w:r>
+        <w:t>)</w:t>
+      </w:r>
+      <w:r>
+        <w:tab/>
+      </w:r>
+      <w:r>
+        <w:tab/>
+      </w:r>
+      <w:r>
+        <w:tab/>
+      </w:r>
+      <w:r>
+        <w:tab/>
+      </w:r>
+      <w:r>
+        <w:tab/>
+      </w:r>
+      <w:r>
+        <w:tab/>
+      </w:r>
+      <w:r>
+        <w:tab/>
+      </w:r>
+    </w:p>
+    <w:p>
+      <w:pPr>
+        <w:spacing w:line="240" w:lineRule="auto"/>
+      </w:pPr>
+      <w:r>
+        <w:tab/>
+      </w:r>
+      <w:r>
+        <w:tab/>
+      </w:r>
+      <w:r>
+        <w:tab/>
+        <w:t xml:space="preserve">  |</w:t>
+      </w:r>
+      <w:r>
+        <w:tab/>
+      </w:r>
+      <w:r>
+        <w:tab/>
+        <w:t>|</w:t>
+      </w:r>
+    </w:p>
+    <w:p>
+      <w:pPr>
+        <w:spacing w:line="240" w:lineRule="auto"/>
+        <w:ind w:firstLine="720"/>
+        <w:jc w:val="center"/>
+      </w:pPr>
+      <w:r>
+        <w:t>CLOSED (by 2)    CLOSED (by 7)</w:t>
+      </w:r>
+      <w:r>
+        <w:tab/>
+      </w:r>
+      <w:r>
+        <w:tab/>
+      </w:r>
+      <w:r>
+        <w:tab/>
+      </w:r>
+      <w:r>
+        <w:tab/>
+      </w:r>
+      <w:r>
+        <w:tab/>
+      </w:r>
+      <w:r>
+        <w:tab/>
+      </w:r>
+    </w:p>
     <w:sectPr>
       <w:pgSz w:w="12240" w:h="15840"/>
       <w:pgMar w:top="1440" w:right="1440" w:bottom="1440" w:left="1440" w:header="720" w:footer="720" w:gutter="0"/>
@@ -1013,7 +4002,7 @@
   <w:style w:type="paragraph" w:default="1" w:styleId="Normal">
     <w:name w:val="Normal"/>
     <w:qFormat/>
-    <w:rsid w:val="00433EC3"/>
+    <w:rsid w:val="000C2319"/>
     <w:pPr>
       <w:suppressAutoHyphens/>
     </w:pPr>
@@ -1546,6 +4535,25 @@
       <w:spacing w:val="5"/>
     </w:rPr>
   </w:style>
+  <w:style w:type="table" w:styleId="TableGrid">
+    <w:name w:val="Table Grid"/>
+    <w:basedOn w:val="TableNormal"/>
+    <w:uiPriority w:val="39"/>
+    <w:rsid w:val="00E8332B"/>
+    <w:pPr>
+      <w:spacing w:line="240" w:lineRule="auto"/>
+    </w:pPr>
+    <w:tblPr>
+      <w:tblBorders>
+        <w:top w:val="single" w:sz="4" w:space="0" w:color="auto"/>
+        <w:left w:val="single" w:sz="4" w:space="0" w:color="auto"/>
+        <w:bottom w:val="single" w:sz="4" w:space="0" w:color="auto"/>
+        <w:right w:val="single" w:sz="4" w:space="0" w:color="auto"/>
+        <w:insideH w:val="single" w:sz="4" w:space="0" w:color="auto"/>
+        <w:insideV w:val="single" w:sz="4" w:space="0" w:color="auto"/>
+      </w:tblBorders>
+    </w:tblPr>
+  </w:style>
 </w:styles>
 </file>
 

</xml_diff>